<commit_message>
Writing progress points for week 5
</commit_message>
<xml_diff>
--- a/Notes and Reports/Independent study log_.docx
+++ b/Notes and Reports/Independent study log_.docx
@@ -1260,10 +1260,7 @@
         </w:numPr>
       </w:pPr>
       <w:r>
-        <w:t>Began designing the SQLite database structure</w:t>
-      </w:r>
-      <w:r>
-        <w:t xml:space="preserve">. </w:t>
+        <w:t xml:space="preserve">Began designing the SQLite database structure. </w:t>
       </w:r>
     </w:p>
     <w:p>
@@ -1301,14 +1298,7 @@
           <w:b/>
           <w:bCs/>
         </w:rPr>
-        <w:t xml:space="preserve">July </w:t>
-      </w:r>
-      <w:r>
-        <w:rPr>
-          <w:b/>
-          <w:bCs/>
-        </w:rPr>
-        <w:t>13</w:t>
+        <w:t>July 13</w:t>
       </w:r>
       <w:r>
         <w:rPr>
@@ -1330,14 +1320,7 @@
           <w:b/>
           <w:bCs/>
         </w:rPr>
-        <w:t>uly 1</w:t>
-      </w:r>
-      <w:r>
-        <w:rPr>
-          <w:b/>
-          <w:bCs/>
-        </w:rPr>
-        <w:t>9</w:t>
+        <w:t>uly 19</w:t>
       </w:r>
       <w:r>
         <w:rPr>
@@ -1491,10 +1474,7 @@
         </w:numPr>
       </w:pPr>
       <w:r>
-        <w:t>Determine which additional multimodal model(s) to integrate</w:t>
-      </w:r>
-      <w:r>
-        <w:t>.</w:t>
+        <w:t>Determine which additional multimodal model(s) to integrate.</w:t>
       </w:r>
     </w:p>
     <w:p>
@@ -1550,7 +1530,102 @@
         <w:t xml:space="preserve">Progress/ Decisions </w:t>
       </w:r>
     </w:p>
-    <w:p/>
+    <w:p>
+      <w:pPr>
+        <w:pStyle w:val="ListParagraph"/>
+        <w:numPr>
+          <w:ilvl w:val="0"/>
+          <w:numId w:val="2"/>
+        </w:numPr>
+      </w:pPr>
+      <w:r>
+        <w:t>Configured</w:t>
+      </w:r>
+      <w:r>
+        <w:t xml:space="preserve"> the Gemini</w:t>
+      </w:r>
+      <w:r>
+        <w:t xml:space="preserve"> API request to enforce the JSON schema through the ‘response_format’ parameter.</w:t>
+      </w:r>
+      <w:r>
+        <w:t xml:space="preserve"> </w:t>
+      </w:r>
+    </w:p>
+    <w:p>
+      <w:pPr>
+        <w:pStyle w:val="ListParagraph"/>
+        <w:numPr>
+          <w:ilvl w:val="0"/>
+          <w:numId w:val="2"/>
+        </w:numPr>
+      </w:pPr>
+      <w:r>
+        <w:t>Added a validation function to verify the required fields, data types, and values of each JSON response before saving.</w:t>
+      </w:r>
+    </w:p>
+    <w:p>
+      <w:pPr>
+        <w:pStyle w:val="ListParagraph"/>
+        <w:numPr>
+          <w:ilvl w:val="0"/>
+          <w:numId w:val="2"/>
+        </w:numPr>
+      </w:pPr>
+      <w:r>
+        <w:t xml:space="preserve">Improved the </w:t>
+      </w:r>
+      <w:r>
+        <w:t>Markdown cleaning process of output responses by</w:t>
+      </w:r>
+      <w:r>
+        <w:t xml:space="preserve"> adding an empty fence </w:t>
+      </w:r>
+      <w:r>
+        <w:t>case and</w:t>
+      </w:r>
+      <w:r>
+        <w:t xml:space="preserve"> </w:t>
+      </w:r>
+      <w:r>
+        <w:t xml:space="preserve">moved the cleaning logic into a separate function. </w:t>
+      </w:r>
+    </w:p>
+    <w:p>
+      <w:pPr>
+        <w:pStyle w:val="ListParagraph"/>
+        <w:numPr>
+          <w:ilvl w:val="0"/>
+          <w:numId w:val="2"/>
+        </w:numPr>
+      </w:pPr>
+      <w:r>
+        <w:t>Refactored the</w:t>
+      </w:r>
+      <w:r>
+        <w:t xml:space="preserve"> save</w:t>
+      </w:r>
+      <w:r>
+        <w:t xml:space="preserve"> output</w:t>
+      </w:r>
+      <w:r>
+        <w:t xml:space="preserve"> function </w:t>
+      </w:r>
+      <w:r>
+        <w:t xml:space="preserve">to call the </w:t>
+      </w:r>
+      <w:r>
+        <w:t>validation</w:t>
+      </w:r>
+      <w:r>
+        <w:t xml:space="preserve"> function</w:t>
+      </w:r>
+      <w:r>
+        <w:t xml:space="preserve"> </w:t>
+      </w:r>
+      <w:r>
+        <w:t xml:space="preserve">before writing to file and saving. </w:t>
+      </w:r>
+    </w:p>
     <w:sectPr>
       <w:pgSz w:w="12240" w:h="15840"/>
       <w:pgMar w:top="720" w:right="720" w:bottom="720" w:left="720" w:header="720" w:footer="720" w:gutter="0"/>
@@ -2896,6 +2971,36 @@
       <w:shd w:val="clear" w:color="auto" w:fill="E1DFDD"/>
     </w:rPr>
   </w:style>
+  <w:style w:type="paragraph" w:styleId="HTMLPreformatted">
+    <w:name w:val="HTML Preformatted"/>
+    <w:basedOn w:val="Normal"/>
+    <w:link w:val="HTMLPreformattedChar"/>
+    <w:uiPriority w:val="99"/>
+    <w:semiHidden/>
+    <w:unhideWhenUsed/>
+    <w:rsid w:val="004E22CA"/>
+    <w:pPr>
+      <w:spacing w:after="0" w:line="240" w:lineRule="auto"/>
+    </w:pPr>
+    <w:rPr>
+      <w:rFonts w:ascii="Consolas" w:hAnsi="Consolas"/>
+      <w:sz w:val="20"/>
+      <w:szCs w:val="20"/>
+    </w:rPr>
+  </w:style>
+  <w:style w:type="character" w:customStyle="1" w:styleId="HTMLPreformattedChar">
+    <w:name w:val="HTML Preformatted Char"/>
+    <w:basedOn w:val="DefaultParagraphFont"/>
+    <w:link w:val="HTMLPreformatted"/>
+    <w:uiPriority w:val="99"/>
+    <w:semiHidden/>
+    <w:rsid w:val="004E22CA"/>
+    <w:rPr>
+      <w:rFonts w:ascii="Consolas" w:hAnsi="Consolas"/>
+      <w:sz w:val="20"/>
+      <w:szCs w:val="20"/>
+    </w:rPr>
+  </w:style>
 </w:styles>
 </file>
 

</xml_diff>

<commit_message>
Updating weekly log with progress
</commit_message>
<xml_diff>
--- a/Notes and Reports/Independent study log_.docx
+++ b/Notes and Reports/Independent study log_.docx
@@ -1626,6 +1626,443 @@
         <w:t xml:space="preserve">before writing to file and saving. </w:t>
       </w:r>
     </w:p>
+    <w:p>
+      <w:pPr>
+        <w:shd w:val="clear" w:color="auto" w:fill="E8E8E8" w:themeFill="background2"/>
+        <w:spacing w:after="0"/>
+        <w:rPr>
+          <w:b/>
+          <w:bCs/>
+        </w:rPr>
+      </w:pPr>
+      <w:r>
+        <w:rPr>
+          <w:b/>
+          <w:bCs/>
+        </w:rPr>
+        <w:t xml:space="preserve">Week </w:t>
+      </w:r>
+      <w:r>
+        <w:rPr>
+          <w:b/>
+          <w:bCs/>
+        </w:rPr>
+        <w:t>6</w:t>
+      </w:r>
+      <w:r>
+        <w:rPr>
+          <w:b/>
+          <w:bCs/>
+        </w:rPr>
+        <w:t xml:space="preserve"> (July </w:t>
+      </w:r>
+      <w:r>
+        <w:rPr>
+          <w:b/>
+          <w:bCs/>
+        </w:rPr>
+        <w:t>20</w:t>
+      </w:r>
+      <w:r>
+        <w:rPr>
+          <w:b/>
+          <w:bCs/>
+          <w:vertAlign w:val="superscript"/>
+        </w:rPr>
+        <w:t>th</w:t>
+      </w:r>
+      <w:r>
+        <w:rPr>
+          <w:b/>
+          <w:bCs/>
+        </w:rPr>
+        <w:t xml:space="preserve">– July </w:t>
+      </w:r>
+      <w:r>
+        <w:rPr>
+          <w:b/>
+          <w:bCs/>
+        </w:rPr>
+        <w:t>26</w:t>
+      </w:r>
+      <w:r>
+        <w:rPr>
+          <w:b/>
+          <w:bCs/>
+          <w:vertAlign w:val="superscript"/>
+        </w:rPr>
+        <w:t>th</w:t>
+      </w:r>
+      <w:r>
+        <w:rPr>
+          <w:b/>
+          <w:bCs/>
+        </w:rPr>
+        <w:t>)</w:t>
+      </w:r>
+    </w:p>
+    <w:p>
+      <w:pPr>
+        <w:pStyle w:val="Heading3"/>
+        <w:spacing w:before="0" w:after="0"/>
+        <w:rPr>
+          <w:sz w:val="24"/>
+          <w:szCs w:val="24"/>
+        </w:rPr>
+      </w:pPr>
+      <w:r>
+        <w:rPr>
+          <w:sz w:val="24"/>
+          <w:szCs w:val="24"/>
+        </w:rPr>
+        <w:t>Objectives</w:t>
+      </w:r>
+    </w:p>
+    <w:p>
+      <w:pPr>
+        <w:pStyle w:val="ListParagraph"/>
+        <w:numPr>
+          <w:ilvl w:val="0"/>
+          <w:numId w:val="2"/>
+        </w:numPr>
+      </w:pPr>
+      <w:r>
+        <w:t xml:space="preserve">Finish tasks of creating the database from python and inserting the response outputs from all models. </w:t>
+      </w:r>
+    </w:p>
+    <w:p>
+      <w:pPr>
+        <w:pStyle w:val="ListParagraph"/>
+        <w:numPr>
+          <w:ilvl w:val="0"/>
+          <w:numId w:val="2"/>
+        </w:numPr>
+      </w:pPr>
+      <w:r>
+        <w:t>Adding a fourth AI model into pipeline.</w:t>
+      </w:r>
+    </w:p>
+    <w:p>
+      <w:pPr>
+        <w:pStyle w:val="ListParagraph"/>
+        <w:numPr>
+          <w:ilvl w:val="0"/>
+          <w:numId w:val="2"/>
+        </w:numPr>
+      </w:pPr>
+      <w:r>
+        <w:t xml:space="preserve">Set up the </w:t>
+      </w:r>
+      <w:r>
+        <w:t>R</w:t>
+      </w:r>
+      <w:r>
+        <w:t xml:space="preserve">aspberry </w:t>
+      </w:r>
+      <w:r>
+        <w:t>P</w:t>
+      </w:r>
+      <w:r>
+        <w:t xml:space="preserve">i, connect the camera, and ensure the camera is working by capturing a shot. </w:t>
+      </w:r>
+    </w:p>
+    <w:p>
+      <w:pPr>
+        <w:pStyle w:val="ListParagraph"/>
+        <w:numPr>
+          <w:ilvl w:val="0"/>
+          <w:numId w:val="2"/>
+        </w:numPr>
+      </w:pPr>
+      <w:r>
+        <w:t xml:space="preserve">Begin the python scripts or functions that will control the </w:t>
+      </w:r>
+      <w:r>
+        <w:t>R</w:t>
+      </w:r>
+      <w:r>
+        <w:t xml:space="preserve">aspberry </w:t>
+      </w:r>
+      <w:r>
+        <w:t>P</w:t>
+      </w:r>
+      <w:r>
+        <w:t xml:space="preserve">i camera, capture image, and integrate that image into the pipeline designed. </w:t>
+      </w:r>
+    </w:p>
+    <w:p>
+      <w:pPr>
+        <w:pStyle w:val="Heading3"/>
+        <w:spacing w:before="0" w:after="0"/>
+        <w:rPr>
+          <w:sz w:val="24"/>
+          <w:szCs w:val="24"/>
+        </w:rPr>
+      </w:pPr>
+      <w:r>
+        <w:rPr>
+          <w:sz w:val="24"/>
+          <w:szCs w:val="24"/>
+        </w:rPr>
+        <w:t xml:space="preserve">To-Do/ Questions </w:t>
+      </w:r>
+    </w:p>
+    <w:p>
+      <w:pPr>
+        <w:pStyle w:val="ListParagraph"/>
+        <w:numPr>
+          <w:ilvl w:val="0"/>
+          <w:numId w:val="2"/>
+        </w:numPr>
+      </w:pPr>
+      <w:r>
+        <w:t>Determine which additional multimodal model(s) to integrate.</w:t>
+      </w:r>
+    </w:p>
+    <w:p>
+      <w:pPr>
+        <w:pStyle w:val="ListParagraph"/>
+        <w:numPr>
+          <w:ilvl w:val="0"/>
+          <w:numId w:val="2"/>
+        </w:numPr>
+      </w:pPr>
+      <w:r>
+        <w:lastRenderedPageBreak/>
+        <w:t>Evaluate previous database project and integrate relevant pieces to this project.</w:t>
+      </w:r>
+    </w:p>
+    <w:p>
+      <w:pPr>
+        <w:pStyle w:val="Heading3"/>
+        <w:spacing w:before="0" w:after="0"/>
+        <w:rPr>
+          <w:sz w:val="24"/>
+          <w:szCs w:val="24"/>
+        </w:rPr>
+      </w:pPr>
+      <w:r>
+        <w:rPr>
+          <w:sz w:val="24"/>
+          <w:szCs w:val="24"/>
+        </w:rPr>
+        <w:t xml:space="preserve">Progress/ Decisions </w:t>
+      </w:r>
+    </w:p>
+    <w:p>
+      <w:pPr>
+        <w:pStyle w:val="ListParagraph"/>
+        <w:numPr>
+          <w:ilvl w:val="0"/>
+          <w:numId w:val="2"/>
+        </w:numPr>
+      </w:pPr>
+      <w:r>
+        <w:t xml:space="preserve">Successfully </w:t>
+      </w:r>
+      <w:r>
+        <w:t>ran query to obtain</w:t>
+      </w:r>
+      <w:r>
+        <w:t xml:space="preserve"> all image responses from </w:t>
+      </w:r>
+      <w:r>
+        <w:t xml:space="preserve">all </w:t>
+      </w:r>
+      <w:r>
+        <w:t>AI models in SQLite.</w:t>
+      </w:r>
+    </w:p>
+    <w:p>
+      <w:pPr>
+        <w:pStyle w:val="ListParagraph"/>
+        <w:numPr>
+          <w:ilvl w:val="0"/>
+          <w:numId w:val="2"/>
+        </w:numPr>
+      </w:pPr>
+      <w:r>
+        <w:t xml:space="preserve">Added </w:t>
+      </w:r>
+      <w:r>
+        <w:t>Mistral's</w:t>
+      </w:r>
+      <w:r>
+        <w:t xml:space="preserve"> AI language model</w:t>
+      </w:r>
+      <w:r>
+        <w:t xml:space="preserve"> </w:t>
+      </w:r>
+      <w:r>
+        <w:t xml:space="preserve">because it supports image processing. </w:t>
+      </w:r>
+    </w:p>
+    <w:p>
+      <w:pPr>
+        <w:pStyle w:val="ListParagraph"/>
+        <w:numPr>
+          <w:ilvl w:val="1"/>
+          <w:numId w:val="2"/>
+        </w:numPr>
+      </w:pPr>
+      <w:r>
+        <w:t>Initially considered DeepSeek as an additional model but found that its API does not currently support direct image input</w:t>
+      </w:r>
+      <w:r>
+        <w:t xml:space="preserve">, which is necessary for a fair comparison with the other AI models. </w:t>
+      </w:r>
+    </w:p>
+    <w:p>
+      <w:pPr>
+        <w:pStyle w:val="ListParagraph"/>
+        <w:numPr>
+          <w:ilvl w:val="1"/>
+          <w:numId w:val="2"/>
+        </w:numPr>
+      </w:pPr>
+      <w:r>
+        <w:t>Also, this project opted out of Microsoft Copilot because its developer workflow involved configuring an agent and underlying vision-capable model through Copilot Studio/Microsoft Foundry rather than providing a directly comparable standalone Copilot vision model API.</w:t>
+      </w:r>
+    </w:p>
+    <w:p>
+      <w:pPr>
+        <w:pStyle w:val="ListParagraph"/>
+        <w:numPr>
+          <w:ilvl w:val="0"/>
+          <w:numId w:val="2"/>
+        </w:numPr>
+      </w:pPr>
+      <w:r>
+        <w:t>Connected and configured the Raspberry Pi Camera Module 3. Verified that the camera sensor was detected by the Raspberry Pi and successfully captured a test image using libcamera-still.</w:t>
+      </w:r>
+    </w:p>
+    <w:p>
+      <w:pPr>
+        <w:shd w:val="clear" w:color="auto" w:fill="E8E8E8" w:themeFill="background2"/>
+        <w:spacing w:after="0"/>
+        <w:rPr>
+          <w:b/>
+          <w:bCs/>
+        </w:rPr>
+      </w:pPr>
+      <w:r>
+        <w:rPr>
+          <w:b/>
+          <w:bCs/>
+        </w:rPr>
+        <w:t xml:space="preserve">Week </w:t>
+      </w:r>
+      <w:r>
+        <w:rPr>
+          <w:b/>
+          <w:bCs/>
+        </w:rPr>
+        <w:t>7</w:t>
+      </w:r>
+      <w:r>
+        <w:rPr>
+          <w:b/>
+          <w:bCs/>
+        </w:rPr>
+        <w:t xml:space="preserve"> (July 2</w:t>
+      </w:r>
+      <w:r>
+        <w:rPr>
+          <w:b/>
+          <w:bCs/>
+        </w:rPr>
+        <w:t>7</w:t>
+      </w:r>
+      <w:r>
+        <w:rPr>
+          <w:b/>
+          <w:bCs/>
+          <w:vertAlign w:val="superscript"/>
+        </w:rPr>
+        <w:t>th</w:t>
+      </w:r>
+      <w:r>
+        <w:rPr>
+          <w:b/>
+          <w:bCs/>
+        </w:rPr>
+        <w:t xml:space="preserve">– </w:t>
+      </w:r>
+      <w:r>
+        <w:rPr>
+          <w:b/>
+          <w:bCs/>
+        </w:rPr>
+        <w:t>August 2</w:t>
+      </w:r>
+      <w:r>
+        <w:rPr>
+          <w:b/>
+          <w:bCs/>
+          <w:vertAlign w:val="superscript"/>
+        </w:rPr>
+        <w:t>nd</w:t>
+      </w:r>
+      <w:r>
+        <w:rPr>
+          <w:b/>
+          <w:bCs/>
+        </w:rPr>
+        <w:t>)</w:t>
+      </w:r>
+    </w:p>
+    <w:p>
+      <w:pPr>
+        <w:pStyle w:val="Heading3"/>
+        <w:spacing w:before="0" w:after="0"/>
+        <w:rPr>
+          <w:sz w:val="24"/>
+          <w:szCs w:val="24"/>
+        </w:rPr>
+      </w:pPr>
+      <w:r>
+        <w:rPr>
+          <w:sz w:val="24"/>
+          <w:szCs w:val="24"/>
+        </w:rPr>
+        <w:t>Objectives</w:t>
+      </w:r>
+    </w:p>
+    <w:p>
+      <w:pPr>
+        <w:pStyle w:val="Heading3"/>
+        <w:spacing w:before="0" w:after="0"/>
+        <w:rPr>
+          <w:sz w:val="24"/>
+          <w:szCs w:val="24"/>
+        </w:rPr>
+      </w:pPr>
+      <w:r>
+        <w:rPr>
+          <w:sz w:val="24"/>
+          <w:szCs w:val="24"/>
+        </w:rPr>
+        <w:t xml:space="preserve">To-Do/ Questions </w:t>
+      </w:r>
+    </w:p>
+    <w:p>
+      <w:pPr>
+        <w:pStyle w:val="Heading3"/>
+        <w:spacing w:before="0" w:after="0"/>
+        <w:rPr>
+          <w:sz w:val="24"/>
+          <w:szCs w:val="24"/>
+        </w:rPr>
+      </w:pPr>
+      <w:r>
+        <w:rPr>
+          <w:sz w:val="24"/>
+          <w:szCs w:val="24"/>
+        </w:rPr>
+        <w:t xml:space="preserve">Progress/ Decisions </w:t>
+      </w:r>
+    </w:p>
+    <w:p/>
     <w:sectPr>
       <w:pgSz w:w="12240" w:h="15840"/>
       <w:pgMar w:top="720" w:right="720" w:bottom="720" w:left="720" w:header="720" w:footer="720" w:gutter="0"/>
@@ -1771,7 +2208,7 @@
         <w:sz w:val="20"/>
       </w:rPr>
     </w:lvl>
-    <w:lvl w:ilvl="1" w:tentative="1">
+    <w:lvl w:ilvl="1">
       <w:start w:val="1"/>
       <w:numFmt w:val="bullet"/>
       <w:lvlText w:val="o"/>
@@ -2483,7 +2920,6 @@
     <w:next w:val="Normal"/>
     <w:link w:val="Heading3Char"/>
     <w:uiPriority w:val="9"/>
-    <w:semiHidden/>
     <w:unhideWhenUsed/>
     <w:qFormat/>
     <w:rsid w:val="00FA6A19"/>
@@ -2690,7 +3126,6 @@
     <w:basedOn w:val="DefaultParagraphFont"/>
     <w:link w:val="Heading3"/>
     <w:uiPriority w:val="9"/>
-    <w:semiHidden/>
     <w:rsid w:val="00FA6A19"/>
     <w:rPr>
       <w:rFonts w:eastAsiaTheme="majorEastAsia" w:cstheme="majorBidi"/>

</xml_diff>

<commit_message>
Added objectives and to-dos for week 7
</commit_message>
<xml_diff>
--- a/Notes and Reports/Independent study log_.docx
+++ b/Notes and Reports/Independent study log_.docx
@@ -63,7 +63,15 @@
         <w:spacing w:after="0" w:line="240" w:lineRule="auto"/>
       </w:pPr>
       <w:r>
-        <w:t>Meet with professor to discuss  overall scope of the independent study.</w:t>
+        <w:t xml:space="preserve">Meet with professor to discuss  overall scope of </w:t>
+      </w:r>
+      <w:proofErr w:type="gramStart"/>
+      <w:r>
+        <w:t>the independent</w:t>
+      </w:r>
+      <w:proofErr w:type="gramEnd"/>
+      <w:r>
+        <w:t xml:space="preserve"> study.</w:t>
       </w:r>
     </w:p>
     <w:p>
@@ -394,8 +402,13 @@
         <w:t xml:space="preserve"> a</w:t>
       </w:r>
       <w:r>
-        <w:t xml:space="preserve"> KanbanFlow</w:t>
-      </w:r>
+        <w:t xml:space="preserve"> </w:t>
+      </w:r>
+      <w:proofErr w:type="spellStart"/>
+      <w:r>
+        <w:t>KanbanFlow</w:t>
+      </w:r>
+      <w:proofErr w:type="spellEnd"/>
       <w:r>
         <w:t xml:space="preserve"> board</w:t>
       </w:r>
@@ -1418,7 +1431,15 @@
         <w:t>SQLite database</w:t>
       </w:r>
       <w:r>
-        <w:t xml:space="preserve"> and create database. </w:t>
+        <w:t xml:space="preserve"> and </w:t>
+      </w:r>
+      <w:proofErr w:type="gramStart"/>
+      <w:r>
+        <w:t>create</w:t>
+      </w:r>
+      <w:proofErr w:type="gramEnd"/>
+      <w:r>
+        <w:t xml:space="preserve"> database. </w:t>
       </w:r>
     </w:p>
     <w:p>
@@ -1545,7 +1566,15 @@
         <w:t xml:space="preserve"> the Gemini</w:t>
       </w:r>
       <w:r>
-        <w:t xml:space="preserve"> API request to enforce the JSON schema through the ‘response_format’ parameter.</w:t>
+        <w:t xml:space="preserve"> API request to enforce the JSON schema through the ‘</w:t>
+      </w:r>
+      <w:proofErr w:type="spellStart"/>
+      <w:r>
+        <w:t>response_format</w:t>
+      </w:r>
+      <w:proofErr w:type="spellEnd"/>
+      <w:r>
+        <w:t>’ parameter.</w:t>
       </w:r>
       <w:r>
         <w:t xml:space="preserve"> </w:t>
@@ -1586,8 +1615,13 @@
       <w:r>
         <w:t xml:space="preserve"> </w:t>
       </w:r>
-      <w:r>
-        <w:t xml:space="preserve">moved the cleaning logic into a separate function. </w:t>
+      <w:proofErr w:type="gramStart"/>
+      <w:r>
+        <w:t>moved</w:t>
+      </w:r>
+      <w:proofErr w:type="gramEnd"/>
+      <w:r>
+        <w:t xml:space="preserve"> the cleaning logic into a separate function. </w:t>
       </w:r>
     </w:p>
     <w:p>
@@ -1774,8 +1808,13 @@
           <w:numId w:val="2"/>
         </w:numPr>
       </w:pPr>
-      <w:r>
-        <w:t xml:space="preserve">Begin the python scripts or functions that will control the </w:t>
+      <w:proofErr w:type="gramStart"/>
+      <w:r>
+        <w:t>Begin</w:t>
+      </w:r>
+      <w:proofErr w:type="gramEnd"/>
+      <w:r>
+        <w:t xml:space="preserve"> the python scripts or functions that will control the </w:t>
       </w:r>
       <w:r>
         <w:t>R</w:t>
@@ -1829,7 +1868,23 @@
       </w:pPr>
       <w:r>
         <w:lastRenderedPageBreak/>
-        <w:t>Evaluate previous database project and integrate relevant pieces to this project.</w:t>
+        <w:t xml:space="preserve">Evaluate previous database </w:t>
+      </w:r>
+      <w:proofErr w:type="gramStart"/>
+      <w:r>
+        <w:t>project</w:t>
+      </w:r>
+      <w:proofErr w:type="gramEnd"/>
+      <w:r>
+        <w:t xml:space="preserve"> and integrate relevant pieces </w:t>
+      </w:r>
+      <w:proofErr w:type="gramStart"/>
+      <w:r>
+        <w:t>to</w:t>
+      </w:r>
+      <w:proofErr w:type="gramEnd"/>
+      <w:r>
+        <w:t xml:space="preserve"> this project.</w:t>
       </w:r>
     </w:p>
     <w:p>
@@ -1933,7 +1988,23 @@
         </w:numPr>
       </w:pPr>
       <w:r>
-        <w:t>Connected and configured the Raspberry Pi Camera Module 3. Verified that the camera sensor was detected by the Raspberry Pi and successfully captured a test image using libcamera-still.</w:t>
+        <w:t xml:space="preserve">Connected and configured the Raspberry Pi Camera Module 3. Verified that the camera sensor was detected by </w:t>
+      </w:r>
+      <w:proofErr w:type="gramStart"/>
+      <w:r>
+        <w:t>the Raspberry</w:t>
+      </w:r>
+      <w:proofErr w:type="gramEnd"/>
+      <w:r>
+        <w:t xml:space="preserve"> Pi and successfully captured a test image using </w:t>
+      </w:r>
+      <w:proofErr w:type="spellStart"/>
+      <w:r>
+        <w:t>libcamera</w:t>
+      </w:r>
+      <w:proofErr w:type="spellEnd"/>
+      <w:r>
+        <w:t>-still.</w:t>
       </w:r>
     </w:p>
     <w:p>
@@ -2030,6 +2101,150 @@
     </w:p>
     <w:p>
       <w:pPr>
+        <w:pStyle w:val="ListParagraph"/>
+        <w:numPr>
+          <w:ilvl w:val="0"/>
+          <w:numId w:val="2"/>
+        </w:numPr>
+      </w:pPr>
+      <w:r>
+        <w:t>Began piecing together main</w:t>
+      </w:r>
+      <w:r>
+        <w:t xml:space="preserve"> system</w:t>
+      </w:r>
+      <w:r>
+        <w:t xml:space="preserve"> components</w:t>
+      </w:r>
+      <w:r>
+        <w:t>,</w:t>
+      </w:r>
+      <w:r>
+        <w:t xml:space="preserve"> including</w:t>
+      </w:r>
+      <w:r>
+        <w:t xml:space="preserve"> the</w:t>
+      </w:r>
+      <w:r>
+        <w:t xml:space="preserve"> </w:t>
+      </w:r>
+      <w:r>
+        <w:t>P</w:t>
+      </w:r>
+      <w:r>
+        <w:t>ython AI image</w:t>
+      </w:r>
+      <w:r>
+        <w:t>-</w:t>
+      </w:r>
+      <w:r>
+        <w:t>processing backend</w:t>
+      </w:r>
+      <w:r>
+        <w:t>,</w:t>
+      </w:r>
+      <w:r>
+        <w:t xml:space="preserve"> </w:t>
+      </w:r>
+      <w:r>
+        <w:t>R</w:t>
+      </w:r>
+      <w:r>
+        <w:t xml:space="preserve">aspberry </w:t>
+      </w:r>
+      <w:r>
+        <w:t>P</w:t>
+      </w:r>
+      <w:r>
+        <w:t xml:space="preserve">i image capture script and </w:t>
+      </w:r>
+      <w:r>
+        <w:t>F</w:t>
+      </w:r>
+      <w:r>
+        <w:t xml:space="preserve">lask web framework. </w:t>
+      </w:r>
+    </w:p>
+    <w:p>
+      <w:pPr>
+        <w:pStyle w:val="ListParagraph"/>
+        <w:numPr>
+          <w:ilvl w:val="0"/>
+          <w:numId w:val="2"/>
+        </w:numPr>
+      </w:pPr>
+      <w:r>
+        <w:t xml:space="preserve">Create another report </w:t>
+      </w:r>
+      <w:r>
+        <w:t>of all</w:t>
+      </w:r>
+      <w:r>
+        <w:t xml:space="preserve"> AI model responses on the 30 images </w:t>
+      </w:r>
+      <w:r>
+        <w:t>from</w:t>
+      </w:r>
+      <w:r>
+        <w:t xml:space="preserve"> the updated run</w:t>
+      </w:r>
+      <w:r>
+        <w:t>.</w:t>
+      </w:r>
+      <w:r>
+        <w:t xml:space="preserve"> </w:t>
+      </w:r>
+    </w:p>
+    <w:p>
+      <w:pPr>
+        <w:pStyle w:val="ListParagraph"/>
+        <w:numPr>
+          <w:ilvl w:val="0"/>
+          <w:numId w:val="2"/>
+        </w:numPr>
+      </w:pPr>
+      <w:r>
+        <w:t>Develop the</w:t>
+      </w:r>
+      <w:r>
+        <w:t xml:space="preserve"> basic web application that displays a button </w:t>
+      </w:r>
+      <w:r>
+        <w:t>for the user to</w:t>
+      </w:r>
+      <w:r>
+        <w:t xml:space="preserve"> capture an image and send it to all AI models for processing</w:t>
+      </w:r>
+      <w:r>
+        <w:t>.</w:t>
+      </w:r>
+    </w:p>
+    <w:p>
+      <w:pPr>
+        <w:pStyle w:val="ListParagraph"/>
+        <w:numPr>
+          <w:ilvl w:val="1"/>
+          <w:numId w:val="2"/>
+        </w:numPr>
+      </w:pPr>
+      <w:r>
+        <w:t>Incorporate the</w:t>
+      </w:r>
+      <w:r>
+        <w:t xml:space="preserve"> results and summary statistics </w:t>
+      </w:r>
+      <w:r>
+        <w:t xml:space="preserve">of each AI model </w:t>
+      </w:r>
+      <w:r>
+        <w:t xml:space="preserve">from the experimental </w:t>
+      </w:r>
+      <w:r>
+        <w:t xml:space="preserve">phase somewhere in the web app. </w:t>
+      </w:r>
+    </w:p>
+    <w:p>
+      <w:pPr>
         <w:pStyle w:val="Heading3"/>
         <w:spacing w:before="0" w:after="0"/>
         <w:rPr>
@@ -2047,6 +2262,150 @@
     </w:p>
     <w:p>
       <w:pPr>
+        <w:pStyle w:val="ListParagraph"/>
+        <w:numPr>
+          <w:ilvl w:val="0"/>
+          <w:numId w:val="2"/>
+        </w:numPr>
+      </w:pPr>
+      <w:r>
+        <w:t xml:space="preserve">Write </w:t>
+      </w:r>
+      <w:r>
+        <w:t>a P</w:t>
+      </w:r>
+      <w:r>
+        <w:t>ython function to capture an image from camera and save it to specified folder</w:t>
+      </w:r>
+      <w:r>
+        <w:t>.</w:t>
+      </w:r>
+    </w:p>
+    <w:p>
+      <w:pPr>
+        <w:pStyle w:val="ListParagraph"/>
+        <w:numPr>
+          <w:ilvl w:val="0"/>
+          <w:numId w:val="2"/>
+        </w:numPr>
+      </w:pPr>
+      <w:r>
+        <w:t>Create a</w:t>
+      </w:r>
+      <w:r>
+        <w:t xml:space="preserve"> basic</w:t>
+      </w:r>
+      <w:r>
+        <w:t xml:space="preserve"> </w:t>
+      </w:r>
+      <w:r>
+        <w:t>F</w:t>
+      </w:r>
+      <w:r>
+        <w:t xml:space="preserve">lask </w:t>
+      </w:r>
+      <w:r>
+        <w:t xml:space="preserve">application </w:t>
+      </w:r>
+      <w:r>
+        <w:t xml:space="preserve">and call </w:t>
+      </w:r>
+      <w:r>
+        <w:t>the P</w:t>
+      </w:r>
+      <w:r>
+        <w:t xml:space="preserve">ython function </w:t>
+      </w:r>
+      <w:r>
+        <w:t xml:space="preserve">responsible for image capture </w:t>
+      </w:r>
+      <w:r>
+        <w:t xml:space="preserve">to display </w:t>
+      </w:r>
+      <w:r>
+        <w:t>successful image capture.</w:t>
+      </w:r>
+    </w:p>
+    <w:p>
+      <w:pPr>
+        <w:pStyle w:val="ListParagraph"/>
+        <w:numPr>
+          <w:ilvl w:val="0"/>
+          <w:numId w:val="2"/>
+        </w:numPr>
+      </w:pPr>
+      <w:r>
+        <w:t>A table was never created to hold invalid outputs</w:t>
+      </w:r>
+      <w:r>
+        <w:t xml:space="preserve"> </w:t>
+      </w:r>
+      <w:r>
+        <w:t xml:space="preserve"> </w:t>
+      </w:r>
+      <w:r>
+        <w:t>that fail JSON parsing or validation.</w:t>
+      </w:r>
+    </w:p>
+    <w:p>
+      <w:pPr>
+        <w:pStyle w:val="ListParagraph"/>
+        <w:numPr>
+          <w:ilvl w:val="1"/>
+          <w:numId w:val="2"/>
+        </w:numPr>
+      </w:pPr>
+      <w:r>
+        <w:t xml:space="preserve">Expand the </w:t>
+      </w:r>
+      <w:r>
+        <w:t>database to account for invalid model responses.</w:t>
+      </w:r>
+    </w:p>
+    <w:p>
+      <w:pPr>
+        <w:pStyle w:val="ListParagraph"/>
+        <w:numPr>
+          <w:ilvl w:val="0"/>
+          <w:numId w:val="2"/>
+        </w:numPr>
+      </w:pPr>
+      <w:r>
+        <w:t>Write basic Python functions to summarize each model’s assessment counts and calculate the percentages matching parent assessor.</w:t>
+      </w:r>
+    </w:p>
+    <w:p>
+      <w:pPr>
+        <w:pStyle w:val="ListParagraph"/>
+        <w:numPr>
+          <w:ilvl w:val="0"/>
+          <w:numId w:val="2"/>
+        </w:numPr>
+      </w:pPr>
+      <w:r>
+        <w:t>Determine how the Flask application will call the existing AI image-processing functions after an image is captured.</w:t>
+      </w:r>
+    </w:p>
+    <w:p>
+      <w:pPr>
+        <w:pStyle w:val="ListParagraph"/>
+        <w:numPr>
+          <w:ilvl w:val="0"/>
+          <w:numId w:val="2"/>
+        </w:numPr>
+      </w:pPr>
+      <w:r>
+        <w:t xml:space="preserve">Have Flask call the </w:t>
+      </w:r>
+      <w:r>
+        <w:t xml:space="preserve">assessment </w:t>
+      </w:r>
+      <w:r>
+        <w:t>functions and display model statistics retrieved from the database.</w:t>
+      </w:r>
+    </w:p>
+    <w:p>
+      <w:pPr>
         <w:pStyle w:val="Heading3"/>
         <w:spacing w:before="0" w:after="0"/>
         <w:rPr>
@@ -2062,7 +2421,93 @@
         <w:t xml:space="preserve">Progress/ Decisions </w:t>
       </w:r>
     </w:p>
-    <w:p/>
+    <w:p>
+      <w:pPr>
+        <w:pStyle w:val="ListParagraph"/>
+        <w:numPr>
+          <w:ilvl w:val="0"/>
+          <w:numId w:val="2"/>
+        </w:numPr>
+      </w:pPr>
+      <w:r>
+        <w:t>Developed a Python camera capture function using Picamera2. Configured the Camera Module 3 for still-image capture at 4608 × 2592 resolution and successfully saved a captured image to the project's local image directory.</w:t>
+      </w:r>
+    </w:p>
+    <w:p>
+      <w:pPr>
+        <w:pStyle w:val="ListParagraph"/>
+        <w:numPr>
+          <w:ilvl w:val="1"/>
+          <w:numId w:val="2"/>
+        </w:numPr>
+      </w:pPr>
+      <w:hyperlink r:id="rId8" w:history="1">
+        <w:r>
+          <w:rPr>
+            <w:rStyle w:val="Hyperlink"/>
+          </w:rPr>
+          <w:t>https://pip-assets.raspberrypi.com/categories/652-raspberry-pi-camera-module-2/documents/RP-008156-DS-3-picamera2-manual.pdf</w:t>
+        </w:r>
+      </w:hyperlink>
+    </w:p>
+    <w:p>
+      <w:pPr>
+        <w:pStyle w:val="ListParagraph"/>
+        <w:numPr>
+          <w:ilvl w:val="0"/>
+          <w:numId w:val="2"/>
+        </w:numPr>
+      </w:pPr>
+      <w:r>
+        <w:lastRenderedPageBreak/>
+        <w:t xml:space="preserve">Started basic </w:t>
+      </w:r>
+      <w:r>
+        <w:t>F</w:t>
+      </w:r>
+      <w:r>
+        <w:t xml:space="preserve">lask app structure and able to call python function that captures an image from the Raspberry Pi camera. </w:t>
+      </w:r>
+    </w:p>
+    <w:p>
+      <w:pPr>
+        <w:pStyle w:val="ListParagraph"/>
+        <w:numPr>
+          <w:ilvl w:val="0"/>
+          <w:numId w:val="2"/>
+        </w:numPr>
+      </w:pPr>
+      <w:r>
+        <w:t>Created an</w:t>
+      </w:r>
+      <w:r>
+        <w:t xml:space="preserve"> invalid response table </w:t>
+      </w:r>
+      <w:r>
+        <w:t>in the database t</w:t>
+      </w:r>
+      <w:r>
+        <w:t xml:space="preserve">o hold invalid outputs of </w:t>
+      </w:r>
+      <w:r>
+        <w:t xml:space="preserve">AI models. </w:t>
+      </w:r>
+    </w:p>
+    <w:p>
+      <w:pPr>
+        <w:pStyle w:val="ListParagraph"/>
+        <w:numPr>
+          <w:ilvl w:val="0"/>
+          <w:numId w:val="2"/>
+        </w:numPr>
+      </w:pPr>
+    </w:p>
+    <w:p>
+      <w:pPr>
+        <w:pStyle w:val="ListParagraph"/>
+        <w:ind w:left="1440"/>
+      </w:pPr>
+    </w:p>
     <w:sectPr>
       <w:pgSz w:w="12240" w:h="15840"/>
       <w:pgMar w:top="720" w:right="720" w:bottom="720" w:left="720" w:header="720" w:footer="720" w:gutter="0"/>

</xml_diff>

<commit_message>
Updating final week log
</commit_message>
<xml_diff>
--- a/Notes and Reports/Independent study log_.docx
+++ b/Notes and Reports/Independent study log_.docx
@@ -1,6 +1,6 @@
 
 <file path=word/document.xml><?xml version="1.0" encoding="utf-8"?>
-<w:document xmlns:wpc="http://schemas.microsoft.com/office/word/2010/wordprocessingCanvas" xmlns:cx="http://schemas.microsoft.com/office/drawing/2014/chartex" xmlns:cx1="http://schemas.microsoft.com/office/drawing/2015/9/8/chartex" xmlns:cx2="http://schemas.microsoft.com/office/drawing/2015/10/21/chartex" xmlns:cx3="http://schemas.microsoft.com/office/drawing/2016/5/9/chartex" xmlns:cx4="http://schemas.microsoft.com/office/drawing/2016/5/10/chartex" xmlns:cx5="http://schemas.microsoft.com/office/drawing/2016/5/11/chartex" xmlns:cx6="http://schemas.microsoft.com/office/drawing/2016/5/12/chartex" xmlns:cx7="http://schemas.microsoft.com/office/drawing/2016/5/13/chartex" xmlns:cx8="http://schemas.microsoft.com/office/drawing/2016/5/14/chartex" xmlns:mc="http://schemas.openxmlformats.org/markup-compatibility/2006" xmlns:aink="http://schemas.microsoft.com/office/drawing/2016/ink" xmlns:am3d="http://schemas.microsoft.com/office/drawing/2017/model3d" xmlns:o="urn:schemas-microsoft-com:office:office" xmlns:oel="http://schemas.microsoft.com/office/2019/extlst" xmlns:r="http://schemas.openxmlformats.org/officeDocument/2006/relationships" xmlns:m="http://schemas.openxmlformats.org/officeDocument/2006/math" xmlns:v="urn:schemas-microsoft-com:vml" xmlns:wp14="http://schemas.microsoft.com/office/word/2010/wordprocessingDrawing" xmlns:wp="http://schemas.openxmlformats.org/drawingml/2006/wordprocessingDrawing" xmlns:w10="urn:schemas-microsoft-com:office:word" xmlns:w="http://schemas.openxmlformats.org/wordprocessingml/2006/main" xmlns:w14="http://schemas.microsoft.com/office/word/2010/wordml" xmlns:w15="http://schemas.microsoft.com/office/word/2012/wordml" xmlns:w16cex="http://schemas.microsoft.com/office/word/2018/wordml/cex" xmlns:w16cid="http://schemas.microsoft.com/office/word/2016/wordml/cid" xmlns:w16="http://schemas.microsoft.com/office/word/2018/wordml" xmlns:w16du="http://schemas.microsoft.com/office/word/2023/wordml/word16du" xmlns:w16sdtdh="http://schemas.microsoft.com/office/word/2020/wordml/sdtdatahash" xmlns:w16sdtfl="http://schemas.microsoft.com/office/word/2024/wordml/sdtformatlock" xmlns:w16se="http://schemas.microsoft.com/office/word/2015/wordml/symex" xmlns:wpg="http://schemas.microsoft.com/office/word/2010/wordprocessingGroup" xmlns:wpi="http://schemas.microsoft.com/office/word/2010/wordprocessingInk" xmlns:wne="http://schemas.microsoft.com/office/word/2006/wordml" xmlns:wps="http://schemas.microsoft.com/office/word/2010/wordprocessingShape" mc:Ignorable="w14 w15 w16se w16cid w16 w16cex w16sdtdh w16sdtfl w16du wp14">
+<w:document xmlns:wpc="http://schemas.microsoft.com/office/word/2010/wordprocessingCanvas" xmlns:cx="http://schemas.microsoft.com/office/drawing/2014/chartex" xmlns:cx1="http://schemas.microsoft.com/office/drawing/2015/9/8/chartex" xmlns:cx2="http://schemas.microsoft.com/office/drawing/2015/10/21/chartex" xmlns:cx3="http://schemas.microsoft.com/office/drawing/2016/5/9/chartex" xmlns:cx4="http://schemas.microsoft.com/office/drawing/2016/5/10/chartex" xmlns:cx5="http://schemas.microsoft.com/office/drawing/2016/5/11/chartex" xmlns:cx6="http://schemas.microsoft.com/office/drawing/2016/5/12/chartex" xmlns:cx7="http://schemas.microsoft.com/office/drawing/2016/5/13/chartex" xmlns:cx8="http://schemas.microsoft.com/office/drawing/2016/5/14/chartex" xmlns:mc="http://schemas.openxmlformats.org/markup-compatibility/2006" xmlns:aink="http://schemas.microsoft.com/office/drawing/2016/ink" xmlns:am3d="http://schemas.microsoft.com/office/drawing/2017/model3d" xmlns:o="urn:schemas-microsoft-com:office:office" xmlns:oel="http://schemas.microsoft.com/office/2019/extlst" xmlns:r="http://schemas.openxmlformats.org/officeDocument/2006/relationships" xmlns:m="http://schemas.openxmlformats.org/officeDocument/2006/math" xmlns:v="urn:schemas-microsoft-com:vml" xmlns:wp14="http://schemas.microsoft.com/office/word/2010/wordprocessingDrawing" xmlns:wp="http://schemas.openxmlformats.org/drawingml/2006/wordprocessingDrawing" xmlns:w10="urn:schemas-microsoft-com:office:word" xmlns:w="http://schemas.openxmlformats.org/wordprocessingml/2006/main" xmlns:w14="http://schemas.microsoft.com/office/word/2010/wordml" xmlns:w15="http://schemas.microsoft.com/office/word/2012/wordml" xmlns:w16cei="http://schemas.microsoft.com/office/word/2026/wordml/cei" xmlns:w16cex="http://schemas.microsoft.com/office/word/2018/wordml/cex" xmlns:w16cid="http://schemas.microsoft.com/office/word/2016/wordml/cid" xmlns:w16="http://schemas.microsoft.com/office/word/2018/wordml" xmlns:w16du="http://schemas.microsoft.com/office/word/2023/wordml/word16du" xmlns:w16sdtdh="http://schemas.microsoft.com/office/word/2020/wordml/sdtdatahash" xmlns:w16sdtfl="http://schemas.microsoft.com/office/word/2024/wordml/sdtformatlock" xmlns:w16se="http://schemas.microsoft.com/office/word/2015/wordml/symex" xmlns:wpg="http://schemas.microsoft.com/office/word/2010/wordprocessingGroup" xmlns:wpi="http://schemas.microsoft.com/office/word/2010/wordprocessingInk" xmlns:wne="http://schemas.microsoft.com/office/word/2006/wordml" xmlns:wps="http://schemas.microsoft.com/office/word/2010/wordprocessingShape" mc:Ignorable="w14 w15 w16se w16cid w16 w16cex w16sdtdh w16sdtfl w16du wp14">
   <w:body>
     <w:p>
       <w:pPr>
@@ -63,15 +63,7 @@
         <w:spacing w:after="0" w:line="240" w:lineRule="auto"/>
       </w:pPr>
       <w:r>
-        <w:t xml:space="preserve">Meet with professor to discuss  overall scope of </w:t>
-      </w:r>
-      <w:proofErr w:type="gramStart"/>
-      <w:r>
-        <w:t>the independent</w:t>
-      </w:r>
-      <w:proofErr w:type="gramEnd"/>
-      <w:r>
-        <w:t xml:space="preserve"> study.</w:t>
+        <w:t>Meet with professor to discuss  overall scope of the independent study.</w:t>
       </w:r>
     </w:p>
     <w:p>
@@ -402,13 +394,8 @@
         <w:t xml:space="preserve"> a</w:t>
       </w:r>
       <w:r>
-        <w:t xml:space="preserve"> </w:t>
-      </w:r>
-      <w:proofErr w:type="spellStart"/>
-      <w:r>
-        <w:t>KanbanFlow</w:t>
-      </w:r>
-      <w:proofErr w:type="spellEnd"/>
+        <w:t xml:space="preserve"> KanbanFlow</w:t>
+      </w:r>
       <w:r>
         <w:t xml:space="preserve"> board</w:t>
       </w:r>
@@ -501,7 +488,7 @@
       <w:pPr>
         <w:pStyle w:val="ListParagraph"/>
       </w:pPr>
-      <w:hyperlink r:id="rId5" w:history="1">
+      <w:hyperlink r:id="rId6" w:history="1">
         <w:r>
           <w:rPr>
             <w:rStyle w:val="Hyperlink"/>
@@ -533,7 +520,7 @@
       <w:pPr>
         <w:pStyle w:val="ListParagraph"/>
       </w:pPr>
-      <w:hyperlink r:id="rId6" w:history="1">
+      <w:hyperlink r:id="rId7" w:history="1">
         <w:r>
           <w:rPr>
             <w:rStyle w:val="Hyperlink"/>
@@ -565,7 +552,7 @@
       <w:r>
         <w:t xml:space="preserve">Link to Git: </w:t>
       </w:r>
-      <w:hyperlink r:id="rId7" w:history="1">
+      <w:hyperlink r:id="rId8" w:history="1">
         <w:r>
           <w:rPr>
             <w:rStyle w:val="Hyperlink"/>
@@ -1431,15 +1418,7 @@
         <w:t>SQLite database</w:t>
       </w:r>
       <w:r>
-        <w:t xml:space="preserve"> and </w:t>
-      </w:r>
-      <w:proofErr w:type="gramStart"/>
-      <w:r>
-        <w:t>create</w:t>
-      </w:r>
-      <w:proofErr w:type="gramEnd"/>
-      <w:r>
-        <w:t xml:space="preserve"> database. </w:t>
+        <w:t xml:space="preserve"> and create database. </w:t>
       </w:r>
     </w:p>
     <w:p>
@@ -1566,15 +1545,7 @@
         <w:t xml:space="preserve"> the Gemini</w:t>
       </w:r>
       <w:r>
-        <w:t xml:space="preserve"> API request to enforce the JSON schema through the ‘</w:t>
-      </w:r>
-      <w:proofErr w:type="spellStart"/>
-      <w:r>
-        <w:t>response_format</w:t>
-      </w:r>
-      <w:proofErr w:type="spellEnd"/>
-      <w:r>
-        <w:t>’ parameter.</w:t>
+        <w:t xml:space="preserve"> API request to enforce the JSON schema through the ‘response_format’ parameter.</w:t>
       </w:r>
       <w:r>
         <w:t xml:space="preserve"> </w:t>
@@ -1615,13 +1586,8 @@
       <w:r>
         <w:t xml:space="preserve"> </w:t>
       </w:r>
-      <w:proofErr w:type="gramStart"/>
-      <w:r>
-        <w:t>moved</w:t>
-      </w:r>
-      <w:proofErr w:type="gramEnd"/>
-      <w:r>
-        <w:t xml:space="preserve"> the cleaning logic into a separate function. </w:t>
+      <w:r>
+        <w:t xml:space="preserve">moved the cleaning logic into a separate function. </w:t>
       </w:r>
     </w:p>
     <w:p>
@@ -1808,13 +1774,8 @@
           <w:numId w:val="2"/>
         </w:numPr>
       </w:pPr>
-      <w:proofErr w:type="gramStart"/>
-      <w:r>
-        <w:t>Begin</w:t>
-      </w:r>
-      <w:proofErr w:type="gramEnd"/>
-      <w:r>
-        <w:t xml:space="preserve"> the python scripts or functions that will control the </w:t>
+      <w:r>
+        <w:t xml:space="preserve">Begin the python scripts or functions that will control the </w:t>
       </w:r>
       <w:r>
         <w:t>R</w:t>
@@ -1868,23 +1829,7 @@
       </w:pPr>
       <w:r>
         <w:lastRenderedPageBreak/>
-        <w:t xml:space="preserve">Evaluate previous database </w:t>
-      </w:r>
-      <w:proofErr w:type="gramStart"/>
-      <w:r>
-        <w:t>project</w:t>
-      </w:r>
-      <w:proofErr w:type="gramEnd"/>
-      <w:r>
-        <w:t xml:space="preserve"> and integrate relevant pieces </w:t>
-      </w:r>
-      <w:proofErr w:type="gramStart"/>
-      <w:r>
-        <w:t>to</w:t>
-      </w:r>
-      <w:proofErr w:type="gramEnd"/>
-      <w:r>
-        <w:t xml:space="preserve"> this project.</w:t>
+        <w:t>Evaluate previous database project and integrate relevant pieces to this project.</w:t>
       </w:r>
     </w:p>
     <w:p>
@@ -1988,23 +1933,7 @@
         </w:numPr>
       </w:pPr>
       <w:r>
-        <w:t xml:space="preserve">Connected and configured the Raspberry Pi Camera Module 3. Verified that the camera sensor was detected by </w:t>
-      </w:r>
-      <w:proofErr w:type="gramStart"/>
-      <w:r>
-        <w:t>the Raspberry</w:t>
-      </w:r>
-      <w:proofErr w:type="gramEnd"/>
-      <w:r>
-        <w:t xml:space="preserve"> Pi and successfully captured a test image using </w:t>
-      </w:r>
-      <w:proofErr w:type="spellStart"/>
-      <w:r>
-        <w:t>libcamera</w:t>
-      </w:r>
-      <w:proofErr w:type="spellEnd"/>
-      <w:r>
-        <w:t>-still.</w:t>
+        <w:t>Connected and configured the Raspberry Pi Camera Module 3. Verified that the camera sensor was detected by the Raspberry Pi and successfully captured a test image using libcamera-still.</w:t>
       </w:r>
     </w:p>
     <w:p>
@@ -2275,10 +2204,7 @@
         <w:t>a P</w:t>
       </w:r>
       <w:r>
-        <w:t>ython function to capture an image from camera and save it to specified folder</w:t>
-      </w:r>
-      <w:r>
-        <w:t>.</w:t>
+        <w:t>ython function to capture an image from camera and save it to specified folder.</w:t>
       </w:r>
     </w:p>
     <w:p>
@@ -2341,10 +2267,7 @@
         <w:t xml:space="preserve"> </w:t>
       </w:r>
       <w:r>
-        <w:t xml:space="preserve"> </w:t>
-      </w:r>
-      <w:r>
-        <w:t>that fail JSON parsing or validation.</w:t>
+        <w:t xml:space="preserve"> that fail JSON parsing or validation.</w:t>
       </w:r>
     </w:p>
     <w:p>
@@ -2441,7 +2364,7 @@
           <w:numId w:val="2"/>
         </w:numPr>
       </w:pPr>
-      <w:hyperlink r:id="rId8" w:history="1">
+      <w:hyperlink r:id="rId9" w:history="1">
         <w:r>
           <w:rPr>
             <w:rStyle w:val="Hyperlink"/>
@@ -2460,53 +2383,346 @@
       </w:pPr>
       <w:r>
         <w:lastRenderedPageBreak/>
-        <w:t xml:space="preserve">Started basic </w:t>
-      </w:r>
-      <w:r>
-        <w:t>F</w:t>
-      </w:r>
-      <w:r>
-        <w:t xml:space="preserve">lask app structure and able to call python function that captures an image from the Raspberry Pi camera. </w:t>
-      </w:r>
-    </w:p>
-    <w:p>
-      <w:pPr>
-        <w:pStyle w:val="ListParagraph"/>
-        <w:numPr>
-          <w:ilvl w:val="0"/>
-          <w:numId w:val="2"/>
-        </w:numPr>
-      </w:pPr>
-      <w:r>
-        <w:t>Created an</w:t>
-      </w:r>
-      <w:r>
-        <w:t xml:space="preserve"> invalid response table </w:t>
-      </w:r>
-      <w:r>
-        <w:t>in the database t</w:t>
-      </w:r>
-      <w:r>
-        <w:t xml:space="preserve">o hold invalid outputs of </w:t>
-      </w:r>
-      <w:r>
-        <w:t xml:space="preserve">AI models. </w:t>
-      </w:r>
-    </w:p>
-    <w:p>
-      <w:pPr>
-        <w:pStyle w:val="ListParagraph"/>
-        <w:numPr>
-          <w:ilvl w:val="0"/>
-          <w:numId w:val="2"/>
-        </w:numPr>
-      </w:pPr>
-    </w:p>
-    <w:p>
-      <w:pPr>
-        <w:pStyle w:val="ListParagraph"/>
-        <w:ind w:left="1440"/>
-      </w:pPr>
+        <w:t>Developed a Flask-based camera service on the Raspberry Pi waits for HTTP POST requests, captures an image, and returns the JPEG image to the client using Flask's send_file() function.</w:t>
+      </w:r>
+    </w:p>
+    <w:p>
+      <w:pPr>
+        <w:pStyle w:val="ListParagraph"/>
+        <w:numPr>
+          <w:ilvl w:val="0"/>
+          <w:numId w:val="2"/>
+        </w:numPr>
+      </w:pPr>
+      <w:r>
+        <w:t>Developed a Python client on the laptop using the requests library to communicate with the Raspberry Pi, receive the JPEG bytes over HTTP, and save the captured image locally.</w:t>
+      </w:r>
+    </w:p>
+    <w:p>
+      <w:pPr>
+        <w:pStyle w:val="ListParagraph"/>
+        <w:numPr>
+          <w:ilvl w:val="0"/>
+          <w:numId w:val="2"/>
+        </w:numPr>
+      </w:pPr>
+      <w:r>
+        <w:t>Added a database function to insert newly captured images into the Images table and immediately return the corresponding image_id.</w:t>
+      </w:r>
+    </w:p>
+    <w:p>
+      <w:pPr>
+        <w:pStyle w:val="ListParagraph"/>
+        <w:numPr>
+          <w:ilvl w:val="0"/>
+          <w:numId w:val="2"/>
+        </w:numPr>
+      </w:pPr>
+      <w:r>
+        <w:t>Created an InvalidResponse table to store AI outputs that fail JSON parsing or schema validation.</w:t>
+      </w:r>
+    </w:p>
+    <w:p>
+      <w:pPr>
+        <w:pStyle w:val="ListParagraph"/>
+        <w:numPr>
+          <w:ilvl w:val="0"/>
+          <w:numId w:val="2"/>
+        </w:numPr>
+      </w:pPr>
+      <w:r>
+        <w:t>Refactored the AI-processing pipeline to process a single captured image instead of iterating through the original 30-image evaluation dataset.</w:t>
+      </w:r>
+    </w:p>
+    <w:p>
+      <w:pPr>
+        <w:pStyle w:val="ListParagraph"/>
+        <w:numPr>
+          <w:ilvl w:val="0"/>
+          <w:numId w:val="2"/>
+        </w:numPr>
+      </w:pPr>
+      <w:r>
+        <w:t xml:space="preserve">Modified the AI-processing workflow so that valid AI responses are inserted directly into the SQLite database immediately after processing rather </w:t>
+      </w:r>
+      <w:r>
+        <w:t>than the previous</w:t>
+      </w:r>
+      <w:r>
+        <w:t xml:space="preserve"> database population step.</w:t>
+      </w:r>
+    </w:p>
+    <w:p>
+      <w:pPr>
+        <w:pStyle w:val="ListParagraph"/>
+        <w:numPr>
+          <w:ilvl w:val="0"/>
+          <w:numId w:val="2"/>
+        </w:numPr>
+      </w:pPr>
+      <w:r>
+        <w:t>Integrated the complete image acquisition pipeline:</w:t>
+      </w:r>
+    </w:p>
+    <w:p>
+      <w:pPr>
+        <w:pStyle w:val="ListParagraph"/>
+        <w:numPr>
+          <w:ilvl w:val="1"/>
+          <w:numId w:val="2"/>
+        </w:numPr>
+      </w:pPr>
+      <w:r>
+        <w:t>Capture image from Raspberry Pi.</w:t>
+      </w:r>
+    </w:p>
+    <w:p>
+      <w:pPr>
+        <w:pStyle w:val="ListParagraph"/>
+        <w:numPr>
+          <w:ilvl w:val="1"/>
+          <w:numId w:val="2"/>
+        </w:numPr>
+      </w:pPr>
+      <w:r>
+        <w:t>Save image locally on the laptop.</w:t>
+      </w:r>
+    </w:p>
+    <w:p>
+      <w:pPr>
+        <w:pStyle w:val="ListParagraph"/>
+        <w:numPr>
+          <w:ilvl w:val="1"/>
+          <w:numId w:val="2"/>
+        </w:numPr>
+      </w:pPr>
+      <w:r>
+        <w:t>Insert image metadata into the database.</w:t>
+      </w:r>
+    </w:p>
+    <w:p>
+      <w:pPr>
+        <w:pStyle w:val="ListParagraph"/>
+        <w:numPr>
+          <w:ilvl w:val="1"/>
+          <w:numId w:val="2"/>
+        </w:numPr>
+      </w:pPr>
+      <w:r>
+        <w:t>Process the image using all AI models.</w:t>
+      </w:r>
+    </w:p>
+    <w:p>
+      <w:pPr>
+        <w:pStyle w:val="ListParagraph"/>
+        <w:numPr>
+          <w:ilvl w:val="1"/>
+          <w:numId w:val="2"/>
+        </w:numPr>
+      </w:pPr>
+      <w:r>
+        <w:t>Store valid or invalid model responses in the database.</w:t>
+      </w:r>
+    </w:p>
+    <w:p>
+      <w:pPr>
+        <w:pStyle w:val="ListParagraph"/>
+        <w:numPr>
+          <w:ilvl w:val="0"/>
+          <w:numId w:val="2"/>
+        </w:numPr>
+      </w:pPr>
+      <w:r>
+        <w:t>Added a</w:t>
+      </w:r>
+      <w:r>
+        <w:t xml:space="preserve"> camera preview </w:t>
+      </w:r>
+      <w:r>
+        <w:t>function</w:t>
+      </w:r>
+      <w:r>
+        <w:t xml:space="preserve"> </w:t>
+      </w:r>
+      <w:r>
+        <w:t xml:space="preserve">to verify image quality </w:t>
+      </w:r>
+      <w:r>
+        <w:t>before beginning a monitoring session.</w:t>
+      </w:r>
+    </w:p>
+    <w:p>
+      <w:pPr>
+        <w:shd w:val="clear" w:color="auto" w:fill="E8E8E8" w:themeFill="background2"/>
+        <w:spacing w:after="0"/>
+        <w:rPr>
+          <w:b/>
+          <w:bCs/>
+        </w:rPr>
+      </w:pPr>
+      <w:r>
+        <w:rPr>
+          <w:b/>
+          <w:bCs/>
+        </w:rPr>
+        <w:t xml:space="preserve">Week </w:t>
+      </w:r>
+      <w:r>
+        <w:rPr>
+          <w:b/>
+          <w:bCs/>
+        </w:rPr>
+        <w:t>8</w:t>
+      </w:r>
+      <w:r>
+        <w:rPr>
+          <w:b/>
+          <w:bCs/>
+        </w:rPr>
+        <w:t xml:space="preserve"> (</w:t>
+      </w:r>
+      <w:r>
+        <w:rPr>
+          <w:b/>
+          <w:bCs/>
+        </w:rPr>
+        <w:t>August 3</w:t>
+      </w:r>
+      <w:r>
+        <w:rPr>
+          <w:b/>
+          <w:bCs/>
+          <w:vertAlign w:val="superscript"/>
+        </w:rPr>
+        <w:t>rd</w:t>
+      </w:r>
+      <w:r>
+        <w:rPr>
+          <w:b/>
+          <w:bCs/>
+        </w:rPr>
+        <w:t xml:space="preserve">– August </w:t>
+      </w:r>
+      <w:r>
+        <w:rPr>
+          <w:b/>
+          <w:bCs/>
+        </w:rPr>
+        <w:t>7</w:t>
+      </w:r>
+      <w:r>
+        <w:rPr>
+          <w:b/>
+          <w:bCs/>
+          <w:vertAlign w:val="superscript"/>
+        </w:rPr>
+        <w:t>th</w:t>
+      </w:r>
+      <w:r>
+        <w:rPr>
+          <w:b/>
+          <w:bCs/>
+        </w:rPr>
+        <w:t>)</w:t>
+      </w:r>
+    </w:p>
+    <w:p>
+      <w:pPr>
+        <w:pStyle w:val="Heading3"/>
+        <w:spacing w:before="0" w:after="0"/>
+        <w:rPr>
+          <w:sz w:val="24"/>
+          <w:szCs w:val="24"/>
+        </w:rPr>
+      </w:pPr>
+      <w:r>
+        <w:rPr>
+          <w:sz w:val="24"/>
+          <w:szCs w:val="24"/>
+        </w:rPr>
+        <w:t>Objectives</w:t>
+      </w:r>
+    </w:p>
+    <w:p>
+      <w:pPr>
+        <w:pStyle w:val="ListParagraph"/>
+        <w:numPr>
+          <w:ilvl w:val="0"/>
+          <w:numId w:val="2"/>
+        </w:numPr>
+      </w:pPr>
+      <w:r>
+        <w:t>Complete the automated monitoring workflow by implementing scheduled image capture sessions.</w:t>
+      </w:r>
+    </w:p>
+    <w:p>
+      <w:pPr>
+        <w:pStyle w:val="ListParagraph"/>
+        <w:numPr>
+          <w:ilvl w:val="0"/>
+          <w:numId w:val="2"/>
+        </w:numPr>
+      </w:pPr>
+      <w:r>
+        <w:t xml:space="preserve">Develop </w:t>
+      </w:r>
+      <w:r>
+        <w:t>a  basic GUI</w:t>
+      </w:r>
+      <w:r>
+        <w:t xml:space="preserve"> interface allowing </w:t>
+      </w:r>
+      <w:r>
+        <w:t>a parent t</w:t>
+      </w:r>
+      <w:r>
+        <w:t xml:space="preserve">o manually capture an image </w:t>
+      </w:r>
+      <w:r>
+        <w:t xml:space="preserve">assessment </w:t>
+      </w:r>
+      <w:r>
+        <w:t>and view AI assessment results</w:t>
+      </w:r>
+      <w:r>
+        <w:t>.</w:t>
+      </w:r>
+    </w:p>
+    <w:p>
+      <w:pPr>
+        <w:pStyle w:val="ListParagraph"/>
+        <w:numPr>
+          <w:ilvl w:val="0"/>
+          <w:numId w:val="2"/>
+        </w:numPr>
+      </w:pPr>
+      <w:r>
+        <w:t>Generate final evaluation statistics and comparison tables for all AI models.</w:t>
+      </w:r>
+    </w:p>
+    <w:p>
+      <w:pPr>
+        <w:pStyle w:val="ListParagraph"/>
+        <w:numPr>
+          <w:ilvl w:val="0"/>
+          <w:numId w:val="2"/>
+        </w:numPr>
+      </w:pPr>
+      <w:r>
+        <w:t>Finalize the system architecture and overall application workflow.</w:t>
+      </w:r>
+    </w:p>
+    <w:p>
+      <w:pPr>
+        <w:pStyle w:val="ListParagraph"/>
+        <w:numPr>
+          <w:ilvl w:val="0"/>
+          <w:numId w:val="2"/>
+        </w:numPr>
+      </w:pPr>
+      <w:r>
+        <w:t>Complete the independent study report and prepare demonstration materials.</w:t>
+      </w:r>
     </w:p>
     <w:sectPr>
       <w:pgSz w:w="12240" w:h="15840"/>
@@ -2519,8 +2735,153 @@
 </file>
 
 <file path=word/numbering.xml><?xml version="1.0" encoding="utf-8"?>
-<w:numbering xmlns:wpc="http://schemas.microsoft.com/office/word/2010/wordprocessingCanvas" xmlns:cx="http://schemas.microsoft.com/office/drawing/2014/chartex" xmlns:cx1="http://schemas.microsoft.com/office/drawing/2015/9/8/chartex" xmlns:cx2="http://schemas.microsoft.com/office/drawing/2015/10/21/chartex" xmlns:cx3="http://schemas.microsoft.com/office/drawing/2016/5/9/chartex" xmlns:cx4="http://schemas.microsoft.com/office/drawing/2016/5/10/chartex" xmlns:cx5="http://schemas.microsoft.com/office/drawing/2016/5/11/chartex" xmlns:cx6="http://schemas.microsoft.com/office/drawing/2016/5/12/chartex" xmlns:cx7="http://schemas.microsoft.com/office/drawing/2016/5/13/chartex" xmlns:cx8="http://schemas.microsoft.com/office/drawing/2016/5/14/chartex" xmlns:mc="http://schemas.openxmlformats.org/markup-compatibility/2006" xmlns:aink="http://schemas.microsoft.com/office/drawing/2016/ink" xmlns:am3d="http://schemas.microsoft.com/office/drawing/2017/model3d" xmlns:o="urn:schemas-microsoft-com:office:office" xmlns:oel="http://schemas.microsoft.com/office/2019/extlst" xmlns:r="http://schemas.openxmlformats.org/officeDocument/2006/relationships" xmlns:m="http://schemas.openxmlformats.org/officeDocument/2006/math" xmlns:v="urn:schemas-microsoft-com:vml" xmlns:wp14="http://schemas.microsoft.com/office/word/2010/wordprocessingDrawing" xmlns:wp="http://schemas.openxmlformats.org/drawingml/2006/wordprocessingDrawing" xmlns:w10="urn:schemas-microsoft-com:office:word" xmlns:w="http://schemas.openxmlformats.org/wordprocessingml/2006/main" xmlns:w14="http://schemas.microsoft.com/office/word/2010/wordml" xmlns:w15="http://schemas.microsoft.com/office/word/2012/wordml" xmlns:w16cex="http://schemas.microsoft.com/office/word/2018/wordml/cex" xmlns:w16cid="http://schemas.microsoft.com/office/word/2016/wordml/cid" xmlns:w16="http://schemas.microsoft.com/office/word/2018/wordml" xmlns:w16du="http://schemas.microsoft.com/office/word/2023/wordml/word16du" xmlns:w16sdtdh="http://schemas.microsoft.com/office/word/2020/wordml/sdtdatahash" xmlns:w16sdtfl="http://schemas.microsoft.com/office/word/2024/wordml/sdtformatlock" xmlns:w16se="http://schemas.microsoft.com/office/word/2015/wordml/symex" xmlns:wpg="http://schemas.microsoft.com/office/word/2010/wordprocessingGroup" xmlns:wpi="http://schemas.microsoft.com/office/word/2010/wordprocessingInk" xmlns:wne="http://schemas.microsoft.com/office/word/2006/wordml" xmlns:wps="http://schemas.microsoft.com/office/word/2010/wordprocessingShape" mc:Ignorable="w14 w15 w16se w16cid w16 w16cex w16sdtdh w16sdtfl w16du wp14">
+<w:numbering xmlns:wpc="http://schemas.microsoft.com/office/word/2010/wordprocessingCanvas" xmlns:cx="http://schemas.microsoft.com/office/drawing/2014/chartex" xmlns:cx1="http://schemas.microsoft.com/office/drawing/2015/9/8/chartex" xmlns:cx2="http://schemas.microsoft.com/office/drawing/2015/10/21/chartex" xmlns:cx3="http://schemas.microsoft.com/office/drawing/2016/5/9/chartex" xmlns:cx4="http://schemas.microsoft.com/office/drawing/2016/5/10/chartex" xmlns:cx5="http://schemas.microsoft.com/office/drawing/2016/5/11/chartex" xmlns:cx6="http://schemas.microsoft.com/office/drawing/2016/5/12/chartex" xmlns:cx7="http://schemas.microsoft.com/office/drawing/2016/5/13/chartex" xmlns:cx8="http://schemas.microsoft.com/office/drawing/2016/5/14/chartex" xmlns:mc="http://schemas.openxmlformats.org/markup-compatibility/2006" xmlns:aink="http://schemas.microsoft.com/office/drawing/2016/ink" xmlns:am3d="http://schemas.microsoft.com/office/drawing/2017/model3d" xmlns:o="urn:schemas-microsoft-com:office:office" xmlns:oel="http://schemas.microsoft.com/office/2019/extlst" xmlns:r="http://schemas.openxmlformats.org/officeDocument/2006/relationships" xmlns:m="http://schemas.openxmlformats.org/officeDocument/2006/math" xmlns:v="urn:schemas-microsoft-com:vml" xmlns:wp14="http://schemas.microsoft.com/office/word/2010/wordprocessingDrawing" xmlns:wp="http://schemas.openxmlformats.org/drawingml/2006/wordprocessingDrawing" xmlns:w10="urn:schemas-microsoft-com:office:word" xmlns:w="http://schemas.openxmlformats.org/wordprocessingml/2006/main" xmlns:w14="http://schemas.microsoft.com/office/word/2010/wordml" xmlns:w15="http://schemas.microsoft.com/office/word/2012/wordml" xmlns:w16cei="http://schemas.microsoft.com/office/word/2026/wordml/cei" xmlns:w16cex="http://schemas.microsoft.com/office/word/2018/wordml/cex" xmlns:w16cid="http://schemas.microsoft.com/office/word/2016/wordml/cid" xmlns:w16="http://schemas.microsoft.com/office/word/2018/wordml" xmlns:w16du="http://schemas.microsoft.com/office/word/2023/wordml/word16du" xmlns:w16sdtdh="http://schemas.microsoft.com/office/word/2020/wordml/sdtdatahash" xmlns:w16sdtfl="http://schemas.microsoft.com/office/word/2024/wordml/sdtformatlock" xmlns:w16se="http://schemas.microsoft.com/office/word/2015/wordml/symex" xmlns:wpg="http://schemas.microsoft.com/office/word/2010/wordprocessingGroup" xmlns:wpi="http://schemas.microsoft.com/office/word/2010/wordprocessingInk" xmlns:wne="http://schemas.microsoft.com/office/word/2006/wordml" xmlns:wps="http://schemas.microsoft.com/office/word/2010/wordprocessingShape" mc:Ignorable="w14 w15 w16se w16cid w16 w16cex w16sdtdh w16sdtfl w16du wp14">
   <w:abstractNum w:abstractNumId="0" w15:restartNumberingAfterBreak="0">
+    <w:nsid w:val="10B65880"/>
+    <w:multiLevelType w:val="multilevel"/>
+    <w:tmpl w:val="CF3CEB7A"/>
+    <w:lvl w:ilvl="0">
+      <w:start w:val="1"/>
+      <w:numFmt w:val="bullet"/>
+      <w:lvlText w:val=""/>
+      <w:lvlJc w:val="left"/>
+      <w:pPr>
+        <w:tabs>
+          <w:tab w:val="num" w:pos="720"/>
+        </w:tabs>
+        <w:ind w:left="720" w:hanging="360"/>
+      </w:pPr>
+      <w:rPr>
+        <w:rFonts w:ascii="Symbol" w:hAnsi="Symbol" w:hint="default"/>
+        <w:sz w:val="20"/>
+      </w:rPr>
+    </w:lvl>
+    <w:lvl w:ilvl="1">
+      <w:start w:val="1"/>
+      <w:numFmt w:val="decimal"/>
+      <w:lvlText w:val="%2."/>
+      <w:lvlJc w:val="left"/>
+      <w:pPr>
+        <w:tabs>
+          <w:tab w:val="num" w:pos="1440"/>
+        </w:tabs>
+        <w:ind w:left="1440" w:hanging="360"/>
+      </w:pPr>
+    </w:lvl>
+    <w:lvl w:ilvl="2" w:tentative="1">
+      <w:start w:val="1"/>
+      <w:numFmt w:val="bullet"/>
+      <w:lvlText w:val=""/>
+      <w:lvlJc w:val="left"/>
+      <w:pPr>
+        <w:tabs>
+          <w:tab w:val="num" w:pos="2160"/>
+        </w:tabs>
+        <w:ind w:left="2160" w:hanging="360"/>
+      </w:pPr>
+      <w:rPr>
+        <w:rFonts w:ascii="Wingdings" w:hAnsi="Wingdings" w:hint="default"/>
+        <w:sz w:val="20"/>
+      </w:rPr>
+    </w:lvl>
+    <w:lvl w:ilvl="3" w:tentative="1">
+      <w:start w:val="1"/>
+      <w:numFmt w:val="bullet"/>
+      <w:lvlText w:val=""/>
+      <w:lvlJc w:val="left"/>
+      <w:pPr>
+        <w:tabs>
+          <w:tab w:val="num" w:pos="2880"/>
+        </w:tabs>
+        <w:ind w:left="2880" w:hanging="360"/>
+      </w:pPr>
+      <w:rPr>
+        <w:rFonts w:ascii="Wingdings" w:hAnsi="Wingdings" w:hint="default"/>
+        <w:sz w:val="20"/>
+      </w:rPr>
+    </w:lvl>
+    <w:lvl w:ilvl="4" w:tentative="1">
+      <w:start w:val="1"/>
+      <w:numFmt w:val="bullet"/>
+      <w:lvlText w:val=""/>
+      <w:lvlJc w:val="left"/>
+      <w:pPr>
+        <w:tabs>
+          <w:tab w:val="num" w:pos="3600"/>
+        </w:tabs>
+        <w:ind w:left="3600" w:hanging="360"/>
+      </w:pPr>
+      <w:rPr>
+        <w:rFonts w:ascii="Wingdings" w:hAnsi="Wingdings" w:hint="default"/>
+        <w:sz w:val="20"/>
+      </w:rPr>
+    </w:lvl>
+    <w:lvl w:ilvl="5" w:tentative="1">
+      <w:start w:val="1"/>
+      <w:numFmt w:val="bullet"/>
+      <w:lvlText w:val=""/>
+      <w:lvlJc w:val="left"/>
+      <w:pPr>
+        <w:tabs>
+          <w:tab w:val="num" w:pos="4320"/>
+        </w:tabs>
+        <w:ind w:left="4320" w:hanging="360"/>
+      </w:pPr>
+      <w:rPr>
+        <w:rFonts w:ascii="Wingdings" w:hAnsi="Wingdings" w:hint="default"/>
+        <w:sz w:val="20"/>
+      </w:rPr>
+    </w:lvl>
+    <w:lvl w:ilvl="6" w:tentative="1">
+      <w:start w:val="1"/>
+      <w:numFmt w:val="bullet"/>
+      <w:lvlText w:val=""/>
+      <w:lvlJc w:val="left"/>
+      <w:pPr>
+        <w:tabs>
+          <w:tab w:val="num" w:pos="5040"/>
+        </w:tabs>
+        <w:ind w:left="5040" w:hanging="360"/>
+      </w:pPr>
+      <w:rPr>
+        <w:rFonts w:ascii="Wingdings" w:hAnsi="Wingdings" w:hint="default"/>
+        <w:sz w:val="20"/>
+      </w:rPr>
+    </w:lvl>
+    <w:lvl w:ilvl="7" w:tentative="1">
+      <w:start w:val="1"/>
+      <w:numFmt w:val="bullet"/>
+      <w:lvlText w:val=""/>
+      <w:lvlJc w:val="left"/>
+      <w:pPr>
+        <w:tabs>
+          <w:tab w:val="num" w:pos="5760"/>
+        </w:tabs>
+        <w:ind w:left="5760" w:hanging="360"/>
+      </w:pPr>
+      <w:rPr>
+        <w:rFonts w:ascii="Wingdings" w:hAnsi="Wingdings" w:hint="default"/>
+        <w:sz w:val="20"/>
+      </w:rPr>
+    </w:lvl>
+    <w:lvl w:ilvl="8" w:tentative="1">
+      <w:start w:val="1"/>
+      <w:numFmt w:val="bullet"/>
+      <w:lvlText w:val=""/>
+      <w:lvlJc w:val="left"/>
+      <w:pPr>
+        <w:tabs>
+          <w:tab w:val="num" w:pos="6480"/>
+        </w:tabs>
+        <w:ind w:left="6480" w:hanging="360"/>
+      </w:pPr>
+      <w:rPr>
+        <w:rFonts w:ascii="Wingdings" w:hAnsi="Wingdings" w:hint="default"/>
+        <w:sz w:val="20"/>
+      </w:rPr>
+    </w:lvl>
+  </w:abstractNum>
+  <w:abstractNum w:abstractNumId="1" w15:restartNumberingAfterBreak="0">
     <w:nsid w:val="4A4171EE"/>
     <w:multiLevelType w:val="hybridMultilevel"/>
     <w:tmpl w:val="EAB82DC6"/>
@@ -2633,7 +2994,7 @@
       </w:rPr>
     </w:lvl>
   </w:abstractNum>
-  <w:abstractNum w:abstractNumId="1" w15:restartNumberingAfterBreak="0">
+  <w:abstractNum w:abstractNumId="2" w15:restartNumberingAfterBreak="0">
     <w:nsid w:val="58032EB8"/>
     <w:multiLevelType w:val="multilevel"/>
     <w:tmpl w:val="0DE0CEDC"/>
@@ -2782,7 +3143,156 @@
       </w:rPr>
     </w:lvl>
   </w:abstractNum>
-  <w:abstractNum w:abstractNumId="2" w15:restartNumberingAfterBreak="0">
+  <w:abstractNum w:abstractNumId="3" w15:restartNumberingAfterBreak="0">
+    <w:nsid w:val="6AEF0F8D"/>
+    <w:multiLevelType w:val="multilevel"/>
+    <w:tmpl w:val="6F3A81B0"/>
+    <w:lvl w:ilvl="0">
+      <w:start w:val="1"/>
+      <w:numFmt w:val="bullet"/>
+      <w:lvlText w:val=""/>
+      <w:lvlJc w:val="left"/>
+      <w:pPr>
+        <w:tabs>
+          <w:tab w:val="num" w:pos="720"/>
+        </w:tabs>
+        <w:ind w:left="720" w:hanging="360"/>
+      </w:pPr>
+      <w:rPr>
+        <w:rFonts w:ascii="Symbol" w:hAnsi="Symbol" w:hint="default"/>
+        <w:sz w:val="20"/>
+      </w:rPr>
+    </w:lvl>
+    <w:lvl w:ilvl="1" w:tentative="1">
+      <w:start w:val="1"/>
+      <w:numFmt w:val="bullet"/>
+      <w:lvlText w:val="o"/>
+      <w:lvlJc w:val="left"/>
+      <w:pPr>
+        <w:tabs>
+          <w:tab w:val="num" w:pos="1440"/>
+        </w:tabs>
+        <w:ind w:left="1440" w:hanging="360"/>
+      </w:pPr>
+      <w:rPr>
+        <w:rFonts w:ascii="Courier New" w:hAnsi="Courier New" w:hint="default"/>
+        <w:sz w:val="20"/>
+      </w:rPr>
+    </w:lvl>
+    <w:lvl w:ilvl="2" w:tentative="1">
+      <w:start w:val="1"/>
+      <w:numFmt w:val="bullet"/>
+      <w:lvlText w:val=""/>
+      <w:lvlJc w:val="left"/>
+      <w:pPr>
+        <w:tabs>
+          <w:tab w:val="num" w:pos="2160"/>
+        </w:tabs>
+        <w:ind w:left="2160" w:hanging="360"/>
+      </w:pPr>
+      <w:rPr>
+        <w:rFonts w:ascii="Wingdings" w:hAnsi="Wingdings" w:hint="default"/>
+        <w:sz w:val="20"/>
+      </w:rPr>
+    </w:lvl>
+    <w:lvl w:ilvl="3" w:tentative="1">
+      <w:start w:val="1"/>
+      <w:numFmt w:val="bullet"/>
+      <w:lvlText w:val=""/>
+      <w:lvlJc w:val="left"/>
+      <w:pPr>
+        <w:tabs>
+          <w:tab w:val="num" w:pos="2880"/>
+        </w:tabs>
+        <w:ind w:left="2880" w:hanging="360"/>
+      </w:pPr>
+      <w:rPr>
+        <w:rFonts w:ascii="Wingdings" w:hAnsi="Wingdings" w:hint="default"/>
+        <w:sz w:val="20"/>
+      </w:rPr>
+    </w:lvl>
+    <w:lvl w:ilvl="4" w:tentative="1">
+      <w:start w:val="1"/>
+      <w:numFmt w:val="bullet"/>
+      <w:lvlText w:val=""/>
+      <w:lvlJc w:val="left"/>
+      <w:pPr>
+        <w:tabs>
+          <w:tab w:val="num" w:pos="3600"/>
+        </w:tabs>
+        <w:ind w:left="3600" w:hanging="360"/>
+      </w:pPr>
+      <w:rPr>
+        <w:rFonts w:ascii="Wingdings" w:hAnsi="Wingdings" w:hint="default"/>
+        <w:sz w:val="20"/>
+      </w:rPr>
+    </w:lvl>
+    <w:lvl w:ilvl="5" w:tentative="1">
+      <w:start w:val="1"/>
+      <w:numFmt w:val="bullet"/>
+      <w:lvlText w:val=""/>
+      <w:lvlJc w:val="left"/>
+      <w:pPr>
+        <w:tabs>
+          <w:tab w:val="num" w:pos="4320"/>
+        </w:tabs>
+        <w:ind w:left="4320" w:hanging="360"/>
+      </w:pPr>
+      <w:rPr>
+        <w:rFonts w:ascii="Wingdings" w:hAnsi="Wingdings" w:hint="default"/>
+        <w:sz w:val="20"/>
+      </w:rPr>
+    </w:lvl>
+    <w:lvl w:ilvl="6" w:tentative="1">
+      <w:start w:val="1"/>
+      <w:numFmt w:val="bullet"/>
+      <w:lvlText w:val=""/>
+      <w:lvlJc w:val="left"/>
+      <w:pPr>
+        <w:tabs>
+          <w:tab w:val="num" w:pos="5040"/>
+        </w:tabs>
+        <w:ind w:left="5040" w:hanging="360"/>
+      </w:pPr>
+      <w:rPr>
+        <w:rFonts w:ascii="Wingdings" w:hAnsi="Wingdings" w:hint="default"/>
+        <w:sz w:val="20"/>
+      </w:rPr>
+    </w:lvl>
+    <w:lvl w:ilvl="7" w:tentative="1">
+      <w:start w:val="1"/>
+      <w:numFmt w:val="bullet"/>
+      <w:lvlText w:val=""/>
+      <w:lvlJc w:val="left"/>
+      <w:pPr>
+        <w:tabs>
+          <w:tab w:val="num" w:pos="5760"/>
+        </w:tabs>
+        <w:ind w:left="5760" w:hanging="360"/>
+      </w:pPr>
+      <w:rPr>
+        <w:rFonts w:ascii="Wingdings" w:hAnsi="Wingdings" w:hint="default"/>
+        <w:sz w:val="20"/>
+      </w:rPr>
+    </w:lvl>
+    <w:lvl w:ilvl="8" w:tentative="1">
+      <w:start w:val="1"/>
+      <w:numFmt w:val="bullet"/>
+      <w:lvlText w:val=""/>
+      <w:lvlJc w:val="left"/>
+      <w:pPr>
+        <w:tabs>
+          <w:tab w:val="num" w:pos="6480"/>
+        </w:tabs>
+        <w:ind w:left="6480" w:hanging="360"/>
+      </w:pPr>
+      <w:rPr>
+        <w:rFonts w:ascii="Wingdings" w:hAnsi="Wingdings" w:hint="default"/>
+        <w:sz w:val="20"/>
+      </w:rPr>
+    </w:lvl>
+  </w:abstractNum>
+  <w:abstractNum w:abstractNumId="4" w15:restartNumberingAfterBreak="0">
     <w:nsid w:val="74756D8F"/>
     <w:multiLevelType w:val="hybridMultilevel"/>
     <w:tmpl w:val="22D81876"/>
@@ -2895,13 +3405,19 @@
     </w:lvl>
   </w:abstractNum>
   <w:num w:numId="1" w16cid:durableId="2112044926">
+    <w:abstractNumId w:val="4"/>
+  </w:num>
+  <w:num w:numId="2" w16cid:durableId="1124887181">
     <w:abstractNumId w:val="2"/>
   </w:num>
-  <w:num w:numId="2" w16cid:durableId="1124887181">
+  <w:num w:numId="3" w16cid:durableId="1649551160">
     <w:abstractNumId w:val="1"/>
   </w:num>
-  <w:num w:numId="3" w16cid:durableId="1649551160">
+  <w:num w:numId="4" w16cid:durableId="872155958">
     <w:abstractNumId w:val="0"/>
+  </w:num>
+  <w:num w:numId="5" w16cid:durableId="1611090558">
+    <w:abstractNumId w:val="3"/>
   </w:num>
 </w:numbering>
 </file>
@@ -3881,6 +4397,30 @@
       <w:szCs w:val="20"/>
     </w:rPr>
   </w:style>
+  <w:style w:type="character" w:styleId="HTMLCode">
+    <w:name w:val="HTML Code"/>
+    <w:basedOn w:val="DefaultParagraphFont"/>
+    <w:uiPriority w:val="99"/>
+    <w:semiHidden/>
+    <w:unhideWhenUsed/>
+    <w:rsid w:val="00155E2A"/>
+    <w:rPr>
+      <w:rFonts w:ascii="Courier New" w:eastAsia="Times New Roman" w:hAnsi="Courier New" w:cs="Courier New"/>
+      <w:sz w:val="20"/>
+      <w:szCs w:val="20"/>
+    </w:rPr>
+  </w:style>
+  <w:style w:type="character" w:styleId="Strong">
+    <w:name w:val="Strong"/>
+    <w:basedOn w:val="DefaultParagraphFont"/>
+    <w:uiPriority w:val="22"/>
+    <w:qFormat/>
+    <w:rsid w:val="00155E2A"/>
+    <w:rPr>
+      <w:b/>
+      <w:bCs/>
+    </w:rPr>
+  </w:style>
 </w:styles>
 </file>
 
@@ -4177,4 +4717,16 @@
     </a:ext>
   </a:extLst>
 </a:theme>
+</file>
+
+<file path=customXml/item1.xml><?xml version="1.0" encoding="utf-8"?>
+<b:Sources xmlns:b="http://schemas.openxmlformats.org/officeDocument/2006/bibliography" xmlns="http://schemas.openxmlformats.org/officeDocument/2006/bibliography" SelectedStyle="\APASixthEditionOfficeOnline.xsl" StyleName="APA" Version="6"/>
+</file>
+
+<file path=customXml/itemProps1.xml><?xml version="1.0" encoding="utf-8"?>
+<ds:datastoreItem xmlns:ds="http://schemas.openxmlformats.org/officeDocument/2006/customXml" ds:itemID="{24A6AAE2-4411-4DC4-B026-6EBB8DD66998}">
+  <ds:schemaRefs>
+    <ds:schemaRef ds:uri="http://schemas.openxmlformats.org/officeDocument/2006/bibliography"/>
+  </ds:schemaRefs>
+</ds:datastoreItem>
 </file>
</xml_diff>

<commit_message>
Logging the final week progress
</commit_message>
<xml_diff>
--- a/Notes and Reports/Independent study log_.docx
+++ b/Notes and Reports/Independent study log_.docx
@@ -63,7 +63,15 @@
         <w:spacing w:after="0" w:line="240" w:lineRule="auto"/>
       </w:pPr>
       <w:r>
-        <w:t>Meet with professor to discuss  overall scope of the independent study.</w:t>
+        <w:t xml:space="preserve">Meet with professor to discuss  overall scope of </w:t>
+      </w:r>
+      <w:proofErr w:type="gramStart"/>
+      <w:r>
+        <w:t>the independent</w:t>
+      </w:r>
+      <w:proofErr w:type="gramEnd"/>
+      <w:r>
+        <w:t xml:space="preserve"> study.</w:t>
       </w:r>
     </w:p>
     <w:p>
@@ -394,8 +402,13 @@
         <w:t xml:space="preserve"> a</w:t>
       </w:r>
       <w:r>
-        <w:t xml:space="preserve"> KanbanFlow</w:t>
-      </w:r>
+        <w:t xml:space="preserve"> </w:t>
+      </w:r>
+      <w:proofErr w:type="spellStart"/>
+      <w:r>
+        <w:t>KanbanFlow</w:t>
+      </w:r>
+      <w:proofErr w:type="spellEnd"/>
       <w:r>
         <w:t xml:space="preserve"> board</w:t>
       </w:r>
@@ -1248,7 +1261,15 @@
         </w:numPr>
       </w:pPr>
       <w:r>
-        <w:t>Decided to implement schema validation and add the file_name field before storing results in SQLite.</w:t>
+        <w:t xml:space="preserve">Decided to implement schema validation and add the </w:t>
+      </w:r>
+      <w:proofErr w:type="spellStart"/>
+      <w:r>
+        <w:t>file_name</w:t>
+      </w:r>
+      <w:proofErr w:type="spellEnd"/>
+      <w:r>
+        <w:t xml:space="preserve"> field before storing results in SQLite.</w:t>
       </w:r>
     </w:p>
     <w:p>
@@ -1418,7 +1439,15 @@
         <w:t>SQLite database</w:t>
       </w:r>
       <w:r>
-        <w:t xml:space="preserve"> and create database. </w:t>
+        <w:t xml:space="preserve"> and </w:t>
+      </w:r>
+      <w:proofErr w:type="gramStart"/>
+      <w:r>
+        <w:t>create</w:t>
+      </w:r>
+      <w:proofErr w:type="gramEnd"/>
+      <w:r>
+        <w:t xml:space="preserve"> database. </w:t>
       </w:r>
     </w:p>
     <w:p>
@@ -1545,7 +1574,15 @@
         <w:t xml:space="preserve"> the Gemini</w:t>
       </w:r>
       <w:r>
-        <w:t xml:space="preserve"> API request to enforce the JSON schema through the ‘response_format’ parameter.</w:t>
+        <w:t xml:space="preserve"> API request to enforce the JSON schema through the ‘</w:t>
+      </w:r>
+      <w:proofErr w:type="spellStart"/>
+      <w:r>
+        <w:t>response_format</w:t>
+      </w:r>
+      <w:proofErr w:type="spellEnd"/>
+      <w:r>
+        <w:t>’ parameter.</w:t>
       </w:r>
       <w:r>
         <w:t xml:space="preserve"> </w:t>
@@ -1586,8 +1623,13 @@
       <w:r>
         <w:t xml:space="preserve"> </w:t>
       </w:r>
-      <w:r>
-        <w:t xml:space="preserve">moved the cleaning logic into a separate function. </w:t>
+      <w:proofErr w:type="gramStart"/>
+      <w:r>
+        <w:t>moved</w:t>
+      </w:r>
+      <w:proofErr w:type="gramEnd"/>
+      <w:r>
+        <w:t xml:space="preserve"> the cleaning logic into a separate function. </w:t>
       </w:r>
     </w:p>
     <w:p>
@@ -1774,8 +1816,13 @@
           <w:numId w:val="2"/>
         </w:numPr>
       </w:pPr>
-      <w:r>
-        <w:t xml:space="preserve">Begin the python scripts or functions that will control the </w:t>
+      <w:proofErr w:type="gramStart"/>
+      <w:r>
+        <w:t>Begin</w:t>
+      </w:r>
+      <w:proofErr w:type="gramEnd"/>
+      <w:r>
+        <w:t xml:space="preserve"> the python scripts or functions that will control the </w:t>
       </w:r>
       <w:r>
         <w:t>R</w:t>
@@ -1829,7 +1876,23 @@
       </w:pPr>
       <w:r>
         <w:lastRenderedPageBreak/>
-        <w:t>Evaluate previous database project and integrate relevant pieces to this project.</w:t>
+        <w:t xml:space="preserve">Evaluate previous database </w:t>
+      </w:r>
+      <w:proofErr w:type="gramStart"/>
+      <w:r>
+        <w:t>project</w:t>
+      </w:r>
+      <w:proofErr w:type="gramEnd"/>
+      <w:r>
+        <w:t xml:space="preserve"> and integrate relevant pieces </w:t>
+      </w:r>
+      <w:proofErr w:type="gramStart"/>
+      <w:r>
+        <w:t>to</w:t>
+      </w:r>
+      <w:proofErr w:type="gramEnd"/>
+      <w:r>
+        <w:t xml:space="preserve"> this project.</w:t>
       </w:r>
     </w:p>
     <w:p>
@@ -1933,7 +1996,23 @@
         </w:numPr>
       </w:pPr>
       <w:r>
-        <w:t>Connected and configured the Raspberry Pi Camera Module 3. Verified that the camera sensor was detected by the Raspberry Pi and successfully captured a test image using libcamera-still.</w:t>
+        <w:t xml:space="preserve">Connected and configured the Raspberry Pi Camera Module 3. Verified that the camera sensor was detected by </w:t>
+      </w:r>
+      <w:proofErr w:type="gramStart"/>
+      <w:r>
+        <w:t>the Raspberry</w:t>
+      </w:r>
+      <w:proofErr w:type="gramEnd"/>
+      <w:r>
+        <w:t xml:space="preserve"> Pi and successfully captured a test image using </w:t>
+      </w:r>
+      <w:proofErr w:type="spellStart"/>
+      <w:r>
+        <w:t>libcamera</w:t>
+      </w:r>
+      <w:proofErr w:type="spellEnd"/>
+      <w:r>
+        <w:t>-still.</w:t>
       </w:r>
     </w:p>
     <w:p>
@@ -2383,7 +2462,15 @@
       </w:pPr>
       <w:r>
         <w:lastRenderedPageBreak/>
-        <w:t>Developed a Flask-based camera service on the Raspberry Pi waits for HTTP POST requests, captures an image, and returns the JPEG image to the client using Flask's send_file() function.</w:t>
+        <w:t xml:space="preserve">Developed a Flask-based camera service on the Raspberry Pi waits for HTTP POST requests, captures an image, and returns the JPEG image to the client using Flask's </w:t>
+      </w:r>
+      <w:proofErr w:type="spellStart"/>
+      <w:r>
+        <w:t>send_file</w:t>
+      </w:r>
+      <w:proofErr w:type="spellEnd"/>
+      <w:r>
+        <w:t>() function.</w:t>
       </w:r>
     </w:p>
     <w:p>
@@ -2407,19 +2494,35 @@
         </w:numPr>
       </w:pPr>
       <w:r>
-        <w:t>Added a database function to insert newly captured images into the Images table and immediately return the corresponding image_id.</w:t>
-      </w:r>
-    </w:p>
-    <w:p>
-      <w:pPr>
-        <w:pStyle w:val="ListParagraph"/>
-        <w:numPr>
-          <w:ilvl w:val="0"/>
-          <w:numId w:val="2"/>
-        </w:numPr>
-      </w:pPr>
-      <w:r>
-        <w:t>Created an InvalidResponse table to store AI outputs that fail JSON parsing or schema validation.</w:t>
+        <w:t xml:space="preserve">Added a database function to insert newly captured images into the Images table and immediately return the corresponding </w:t>
+      </w:r>
+      <w:proofErr w:type="spellStart"/>
+      <w:r>
+        <w:t>image_id</w:t>
+      </w:r>
+      <w:proofErr w:type="spellEnd"/>
+      <w:r>
+        <w:t>.</w:t>
+      </w:r>
+    </w:p>
+    <w:p>
+      <w:pPr>
+        <w:pStyle w:val="ListParagraph"/>
+        <w:numPr>
+          <w:ilvl w:val="0"/>
+          <w:numId w:val="2"/>
+        </w:numPr>
+      </w:pPr>
+      <w:r>
+        <w:t xml:space="preserve">Created an </w:t>
+      </w:r>
+      <w:proofErr w:type="spellStart"/>
+      <w:r>
+        <w:t>InvalidResponse</w:t>
+      </w:r>
+      <w:proofErr w:type="spellEnd"/>
+      <w:r>
+        <w:t xml:space="preserve"> table to store AI outputs that fail JSON parsing or schema validation.</w:t>
       </w:r>
     </w:p>
     <w:p>
@@ -2443,13 +2546,7 @@
         </w:numPr>
       </w:pPr>
       <w:r>
-        <w:t xml:space="preserve">Modified the AI-processing workflow so that valid AI responses are inserted directly into the SQLite database immediately after processing rather </w:t>
-      </w:r>
-      <w:r>
-        <w:t>than the previous</w:t>
-      </w:r>
-      <w:r>
-        <w:t xml:space="preserve"> database population step.</w:t>
+        <w:t>Modified the AI-processing workflow so that valid AI responses are inserted directly into the SQLite database immediately after processing rather than the previous database population step.</w:t>
       </w:r>
     </w:p>
     <w:p>
@@ -2533,22 +2630,7 @@
         </w:numPr>
       </w:pPr>
       <w:r>
-        <w:t>Added a</w:t>
-      </w:r>
-      <w:r>
-        <w:t xml:space="preserve"> camera preview </w:t>
-      </w:r>
-      <w:r>
-        <w:t>function</w:t>
-      </w:r>
-      <w:r>
-        <w:t xml:space="preserve"> </w:t>
-      </w:r>
-      <w:r>
-        <w:t xml:space="preserve">to verify image quality </w:t>
-      </w:r>
-      <w:r>
-        <w:t>before beginning a monitoring session.</w:t>
+        <w:t>Added a camera preview function to verify image quality before beginning a monitoring session.</w:t>
       </w:r>
     </w:p>
     <w:p>
@@ -2640,88 +2722,114 @@
           <w:sz w:val="24"/>
           <w:szCs w:val="24"/>
         </w:rPr>
-        <w:t>Objectives</w:t>
-      </w:r>
-    </w:p>
-    <w:p>
-      <w:pPr>
-        <w:pStyle w:val="ListParagraph"/>
-        <w:numPr>
-          <w:ilvl w:val="0"/>
-          <w:numId w:val="2"/>
-        </w:numPr>
-      </w:pPr>
-      <w:r>
-        <w:t>Complete the automated monitoring workflow by implementing scheduled image capture sessions.</w:t>
-      </w:r>
-    </w:p>
-    <w:p>
-      <w:pPr>
-        <w:pStyle w:val="ListParagraph"/>
-        <w:numPr>
-          <w:ilvl w:val="0"/>
-          <w:numId w:val="2"/>
-        </w:numPr>
-      </w:pPr>
-      <w:r>
-        <w:t xml:space="preserve">Develop </w:t>
-      </w:r>
-      <w:r>
-        <w:t>a  basic GUI</w:t>
-      </w:r>
-      <w:r>
-        <w:t xml:space="preserve"> interface allowing </w:t>
-      </w:r>
-      <w:r>
-        <w:t>a parent t</w:t>
-      </w:r>
-      <w:r>
-        <w:t xml:space="preserve">o manually capture an image </w:t>
-      </w:r>
-      <w:r>
-        <w:t xml:space="preserve">assessment </w:t>
-      </w:r>
-      <w:r>
-        <w:t>and view AI assessment results</w:t>
-      </w:r>
-      <w:r>
-        <w:t>.</w:t>
-      </w:r>
-    </w:p>
-    <w:p>
-      <w:pPr>
-        <w:pStyle w:val="ListParagraph"/>
-        <w:numPr>
-          <w:ilvl w:val="0"/>
-          <w:numId w:val="2"/>
-        </w:numPr>
-      </w:pPr>
-      <w:r>
-        <w:t>Generate final evaluation statistics and comparison tables for all AI models.</w:t>
-      </w:r>
-    </w:p>
-    <w:p>
-      <w:pPr>
-        <w:pStyle w:val="ListParagraph"/>
-        <w:numPr>
-          <w:ilvl w:val="0"/>
-          <w:numId w:val="2"/>
-        </w:numPr>
-      </w:pPr>
-      <w:r>
-        <w:t>Finalize the system architecture and overall application workflow.</w:t>
-      </w:r>
-    </w:p>
-    <w:p>
-      <w:pPr>
-        <w:pStyle w:val="ListParagraph"/>
-        <w:numPr>
-          <w:ilvl w:val="0"/>
-          <w:numId w:val="2"/>
-        </w:numPr>
-      </w:pPr>
-      <w:r>
-        <w:t>Complete the independent study report and prepare demonstration materials.</w:t>
+        <w:t>Final wrap up</w:t>
+      </w:r>
+    </w:p>
+    <w:p>
+      <w:pPr>
+        <w:pStyle w:val="ListParagraph"/>
+        <w:numPr>
+          <w:ilvl w:val="0"/>
+          <w:numId w:val="2"/>
+        </w:numPr>
+      </w:pPr>
+      <w:r>
+        <w:t>Complete</w:t>
+      </w:r>
+      <w:r>
+        <w:t>d</w:t>
+      </w:r>
+      <w:r>
+        <w:t xml:space="preserve"> the automated monitoring workflow by implementing scheduled image capture sessions.</w:t>
+      </w:r>
+    </w:p>
+    <w:p>
+      <w:pPr>
+        <w:pStyle w:val="ListParagraph"/>
+        <w:numPr>
+          <w:ilvl w:val="0"/>
+          <w:numId w:val="2"/>
+        </w:numPr>
+      </w:pPr>
+      <w:r>
+        <w:t>Develop</w:t>
+      </w:r>
+      <w:r>
+        <w:t>ed</w:t>
+      </w:r>
+      <w:r>
+        <w:t xml:space="preserve"> a  basic GUI interface allowing a parent to manually capture an image assessment and view AI assessment results.</w:t>
+      </w:r>
+    </w:p>
+    <w:p>
+      <w:pPr>
+        <w:pStyle w:val="ListParagraph"/>
+        <w:numPr>
+          <w:ilvl w:val="0"/>
+          <w:numId w:val="2"/>
+        </w:numPr>
+      </w:pPr>
+      <w:r>
+        <w:t>Generate</w:t>
+      </w:r>
+      <w:r>
+        <w:t>d</w:t>
+      </w:r>
+      <w:r>
+        <w:t xml:space="preserve"> final evaluation </w:t>
+      </w:r>
+      <w:r>
+        <w:t xml:space="preserve">comparisons </w:t>
+      </w:r>
+      <w:r>
+        <w:t>for all AI models</w:t>
+      </w:r>
+      <w:r>
+        <w:t xml:space="preserve"> and </w:t>
+      </w:r>
+      <w:r>
+        <w:t xml:space="preserve">included a summary </w:t>
+      </w:r>
+      <w:r>
+        <w:t>table.</w:t>
+      </w:r>
+    </w:p>
+    <w:p>
+      <w:pPr>
+        <w:pStyle w:val="ListParagraph"/>
+        <w:numPr>
+          <w:ilvl w:val="0"/>
+          <w:numId w:val="2"/>
+        </w:numPr>
+      </w:pPr>
+      <w:r>
+        <w:t>Finalize</w:t>
+      </w:r>
+      <w:r>
+        <w:t>d</w:t>
+      </w:r>
+      <w:r>
+        <w:t xml:space="preserve"> the system architecture and overall application workflow.</w:t>
+      </w:r>
+    </w:p>
+    <w:p>
+      <w:pPr>
+        <w:pStyle w:val="ListParagraph"/>
+        <w:numPr>
+          <w:ilvl w:val="0"/>
+          <w:numId w:val="2"/>
+        </w:numPr>
+      </w:pPr>
+      <w:r>
+        <w:t xml:space="preserve">Updated the Readme report, weekly logs, </w:t>
+      </w:r>
+      <w:proofErr w:type="spellStart"/>
+      <w:r>
+        <w:t>github</w:t>
+      </w:r>
+      <w:proofErr w:type="spellEnd"/>
+      <w:r>
+        <w:t xml:space="preserve"> repo files. </w:t>
       </w:r>
     </w:p>
     <w:sectPr>
@@ -4032,6 +4140,7 @@
   <w:style w:type="character" w:default="1" w:styleId="DefaultParagraphFont">
     <w:name w:val="Default Paragraph Font"/>
     <w:uiPriority w:val="1"/>
+    <w:semiHidden/>
     <w:unhideWhenUsed/>
   </w:style>
   <w:style w:type="table" w:default="1" w:styleId="TableNormal">

</xml_diff>